<commit_message>
Rapor ve sunum: Çanakkale kovanı 6 kWp, ≈1,5×, ≈1 gün; ≈218 / ≈63 bin $
Co-Authored-By: Claude Opus 5.5 <noreply@anthropic.com>
</commit_message>
<xml_diff>
--- a/belgeler/AERO-GUARD_V3_Proje_Raporu.docx
+++ b/belgeler/AERO-GUARD_V3_Proje_Raporu.docx
@@ -886,7 +886,7 @@
                 <w:sz w:val="30"/>
                 <w:szCs w:val="30"/>
               </w:rPr>
-              <w:t xml:space="preserve">≈215 bin $</w:t>
+              <w:t xml:space="preserve">≈218 bin $</w:t>
             </w:r>
           </w:p>
           <w:p>
@@ -2662,7 +2662,7 @@
                 <w:sz w:val="17"/>
                 <w:szCs w:val="17"/>
               </w:rPr>
-              <w:t xml:space="preserve">Aynı enerji adası; Ek 14 yerleşimi; hesap kovan boyuna göre yenilenir</w:t>
+              <w:t xml:space="preserve">Hesap kovan boyuna göre: Çanakkale kovanında güneş 6 kWp (≈1,5×), türbin ve batarya aynı; Ek 14 yerleşimi</w:t>
             </w:r>
           </w:p>
         </w:tc>
@@ -3187,7 +3187,7 @@
                 <w:sz w:val="17"/>
                 <w:szCs w:val="17"/>
               </w:rPr>
-              <w:t xml:space="preserve">Kovan boyuna göre: mini ≈124, Çanakkale ≈215, kış ≈220 bin $ (±%30)</w:t>
+              <w:t xml:space="preserve">Kovan boyuna göre: mini ≈124, Çanakkale ≈218, kış ≈223 bin $ (±%30)</w:t>
             </w:r>
           </w:p>
         </w:tc>
@@ -9837,7 +9837,7 @@
                 <w:sz w:val="19"/>
                 <w:szCs w:val="19"/>
               </w:rPr>
-              <w:t xml:space="preserve">2 kâşif, 1 bekçi, 1 işçi, nöbetçiler, güvenli konum</w:t>
+              <w:t xml:space="preserve">2 kâşif, 1 bekçi, 1 işçi, nöbetçiler, güvenli konum; güneş 6 kWp</w:t>
             </w:r>
           </w:p>
         </w:tc>
@@ -15165,7 +15165,7 @@
                 <w:sz w:val="18"/>
                 <w:szCs w:val="18"/>
               </w:rPr>
-              <w:t xml:space="preserve">Kovan bataryayla çalışmayı sürdürür (mini kovan yüküyle ≈1,5 gün; Çanakkale kovanında daha kısa, bkz. Bölüm 12.5)</w:t>
+              <w:t xml:space="preserve">Kovan bataryayla çalışmayı sürdürür (mini kovanda ≈1,5 gün, Çanakkale kovanında ≈1 gün; bkz. Bölüm 12.5)</w:t>
             </w:r>
           </w:p>
         </w:tc>
@@ -18036,7 +18036,7 @@
           <w:sz w:val="22"/>
           <w:szCs w:val="22"/>
         </w:rPr>
-        <w:t xml:space="preserve">Enerji adası 4 kWp güneş paneli, 3 kW dikey eksenli rüzgâr türbini ve 20 kWh LFP bataryadan oluşur; şebeke yalnızca yedek olarak bağlıdır. Kovan benzetmesinde batarya kovanın balıdır: güneş ve türbin bataryayı doldurur, batarya bütün hücreleri besler. Bir sorti yaklaşık 0,04–0,05 kWh enerji harcar. Başvuru sürümündeki radar emici kaplama, maliyet ve teknoloji olgunluğu nedeniyle kapsamdan çıkarılmıştır.</w:t>
+        <w:t xml:space="preserve">Mini kovanın enerji adası 4 kWp güneş paneli, 3 kW dikey eksenli rüzgâr türbini ve 20 kWh LFP bataryadan oluşur; Çanakkale kovanında güneş paneli 6 kWp'ye büyütülür, türbin ve batarya aynı kalır (Bölüm 12.5). Şebeke yalnızca yedek olarak bağlıdır. Kovan benzetmesinde batarya kovanın balıdır: güneş ve türbin bataryayı doldurur, batarya bütün hücreleri besler. Bir sorti yaklaşık 0,04–0,05 kWh enerji harcar. Başvuru sürümündeki radar emici kaplama, maliyet ve teknoloji olgunluğu nedeniyle kapsamdan çıkarılmıştır.</w:t>
       </w:r>
     </w:p>
     <w:p>
@@ -19908,12 +19908,1759 @@
           <w:sz w:val="22"/>
           <w:szCs w:val="22"/>
         </w:rPr>
-        <w:t xml:space="preserve">Bekçi ve işçi hücreleri tüketimi artırır; en büyük kalem yine iklimlendirmedir. Çanakkale kovanında hücre sayısı ikiden dörde çıkar. Yalnızca bu etkiyi aynı varsayımla (hücre başına ortalama 100 W) hesaba katmak, iklimlendirmeyi günde 4,8 kWh'ten 9,6 kWh'e, %30 paylı tasarım yükünü ise yılda yaklaşık 4.745 kWh'ten 7.000 kWh'e çıkarır. Üretim bu yükü karşılamaya devam eder, ancak üretim/tasarım yükü oranı yaklaşık 1,8'den 1,2'ye, batarya özerkliği de yaklaşık 1,5 günden 1 güne iner. Nöbetçi kameraların, güvenli konum donanımının ve bekçi ile işçi sortilerinin tüketimi bu kaba kontrole dahil değildir; bunlar eklendiğinde pay daha da daralır.</w:t>
+        <w:t xml:space="preserve">Bekçi ve işçi hücreleri tüketimi artırır; en büyük kalem yine iklimlendirmedir. Çanakkale kovanında hücre sayısı ikiden dörde çıkar ve iki nöbetçi direk eklenir. Mini kovanla aynı varsayımlarla günlük tüketim yaklaşık 16,1 kWh, %30 paylı tasarım yükü yılda yaklaşık 7.620 kWh olur (Tablo 16). Enerji adası 4 kWp güneşle kalsaydı üretim/tasarım yükü oranı yaklaşık 1,1×'e inerdi. Bu nedenle Çanakkale kovanında güneş panelini 6 kWp'ye büyütüyoruz (+2 kWp, ≈2,5 bin $); türbin (3 kW) ve batarya (20 kWh) aynı kalır. Üretim yılda yaklaşık 11.250 kWh'e çıkar ve oran yaklaşık 1,5× olur; 20 kWh batarya tasarım yüküyle yaklaşık 1 günlük özerklik sağlar.</w:t>
       </w:r>
     </w:p>
     <w:p>
       <w:pPr>
-        <w:spacing w:after="100" w:before="0" w:line="360"/>
+        <w:keepNext/>
+        <w:spacing w:after="50" w:before="80" w:line="276"/>
+        <w:jc w:val="left"/>
+      </w:pPr>
+      <w:r>
+        <w:rPr>
+          <w:rFonts w:ascii="Times New Roman" w:cs="Times New Roman" w:eastAsia="Times New Roman" w:hAnsi="Times New Roman"/>
+          <w:i/>
+          <w:iCs/>
+          <w:color w:val="5B6B7B"/>
+          <w:sz w:val="19"/>
+          <w:szCs w:val="19"/>
+        </w:rPr>
+        <w:t xml:space="preserve">Tablo 16. Çanakkale kovanı için yıllık enerji bütçesi (ön tasarım)</w:t>
+      </w:r>
+    </w:p>
+    <w:tbl>
+      <w:tblPr>
+        <w:tblW w:type="dxa" w:w="9638"/>
+        <w:tblBorders>
+          <w:top w:val="single" w:color="auto" w:sz="4"/>
+          <w:left w:val="single" w:color="auto" w:sz="4"/>
+          <w:bottom w:val="single" w:color="auto" w:sz="4"/>
+          <w:right w:val="single" w:color="auto" w:sz="4"/>
+          <w:insideH w:val="single" w:color="auto" w:sz="4"/>
+          <w:insideV w:val="single" w:color="auto" w:sz="4"/>
+        </w:tblBorders>
+        <w:tblLayout w:type="fixed"/>
+      </w:tblPr>
+      <w:tblGrid>
+        <w:gridCol w:w="3500"/>
+        <w:gridCol w:w="3238"/>
+        <w:gridCol w:w="1400"/>
+        <w:gridCol w:w="1500"/>
+      </w:tblGrid>
+      <w:tr>
+        <w:trPr>
+          <w:cantSplit/>
+          <w:tblHeader/>
+        </w:trPr>
+        <w:tc>
+          <w:tcPr>
+            <w:tcW w:type="dxa" w:w="3500"/>
+            <w:tcBorders>
+              <w:top w:val="single" w:color="C9D3DD" w:sz="4"/>
+              <w:left w:val="single" w:color="C9D3DD" w:sz="4"/>
+              <w:bottom w:val="single" w:color="C9D3DD" w:sz="4"/>
+              <w:right w:val="single" w:color="C9D3DD" w:sz="4"/>
+            </w:tcBorders>
+            <w:shd w:fill="0B1E33" w:color="auto" w:val="clear"/>
+            <w:tcMar>
+              <w:top w:type="dxa" w:w="50"/>
+              <w:left w:type="dxa" w:w="90"/>
+              <w:bottom w:type="dxa" w:w="50"/>
+              <w:right w:type="dxa" w:w="90"/>
+            </w:tcMar>
+            <w:vAlign w:val="center"/>
+          </w:tcPr>
+          <w:p>
+            <w:pPr>
+              <w:spacing w:after="0" w:line="252"/>
+              <w:jc w:val="left"/>
+            </w:pPr>
+            <w:r>
+              <w:rPr>
+                <w:rFonts w:ascii="Times New Roman" w:cs="Times New Roman" w:eastAsia="Times New Roman" w:hAnsi="Times New Roman"/>
+                <w:b/>
+                <w:bCs/>
+                <w:color w:val="FFFFFF"/>
+                <w:sz w:val="19"/>
+                <w:szCs w:val="19"/>
+              </w:rPr>
+              <w:t xml:space="preserve">Kalem</w:t>
+            </w:r>
+          </w:p>
+        </w:tc>
+        <w:tc>
+          <w:tcPr>
+            <w:tcW w:type="dxa" w:w="3238"/>
+            <w:tcBorders>
+              <w:top w:val="single" w:color="C9D3DD" w:sz="4"/>
+              <w:left w:val="single" w:color="C9D3DD" w:sz="4"/>
+              <w:bottom w:val="single" w:color="C9D3DD" w:sz="4"/>
+              <w:right w:val="single" w:color="C9D3DD" w:sz="4"/>
+            </w:tcBorders>
+            <w:shd w:fill="0B1E33" w:color="auto" w:val="clear"/>
+            <w:tcMar>
+              <w:top w:type="dxa" w:w="50"/>
+              <w:left w:type="dxa" w:w="90"/>
+              <w:bottom w:type="dxa" w:w="50"/>
+              <w:right w:type="dxa" w:w="90"/>
+            </w:tcMar>
+            <w:vAlign w:val="center"/>
+          </w:tcPr>
+          <w:p>
+            <w:pPr>
+              <w:spacing w:after="0" w:line="252"/>
+              <w:jc w:val="left"/>
+            </w:pPr>
+            <w:r>
+              <w:rPr>
+                <w:rFonts w:ascii="Times New Roman" w:cs="Times New Roman" w:eastAsia="Times New Roman" w:hAnsi="Times New Roman"/>
+                <w:b/>
+                <w:bCs/>
+                <w:color w:val="FFFFFF"/>
+                <w:sz w:val="19"/>
+                <w:szCs w:val="19"/>
+              </w:rPr>
+              <w:t xml:space="preserve">Varsayım</w:t>
+            </w:r>
+          </w:p>
+        </w:tc>
+        <w:tc>
+          <w:tcPr>
+            <w:tcW w:type="dxa" w:w="1400"/>
+            <w:tcBorders>
+              <w:top w:val="single" w:color="C9D3DD" w:sz="4"/>
+              <w:left w:val="single" w:color="C9D3DD" w:sz="4"/>
+              <w:bottom w:val="single" w:color="C9D3DD" w:sz="4"/>
+              <w:right w:val="single" w:color="C9D3DD" w:sz="4"/>
+            </w:tcBorders>
+            <w:shd w:fill="0B1E33" w:color="auto" w:val="clear"/>
+            <w:tcMar>
+              <w:top w:type="dxa" w:w="50"/>
+              <w:left w:type="dxa" w:w="90"/>
+              <w:bottom w:type="dxa" w:w="50"/>
+              <w:right w:type="dxa" w:w="90"/>
+            </w:tcMar>
+            <w:vAlign w:val="center"/>
+          </w:tcPr>
+          <w:p>
+            <w:pPr>
+              <w:spacing w:after="0" w:line="252"/>
+              <w:jc w:val="right"/>
+            </w:pPr>
+            <w:r>
+              <w:rPr>
+                <w:rFonts w:ascii="Times New Roman" w:cs="Times New Roman" w:eastAsia="Times New Roman" w:hAnsi="Times New Roman"/>
+                <w:b/>
+                <w:bCs/>
+                <w:color w:val="FFFFFF"/>
+                <w:sz w:val="19"/>
+                <w:szCs w:val="19"/>
+              </w:rPr>
+              <w:t xml:space="preserve">kWh/gün</w:t>
+            </w:r>
+          </w:p>
+        </w:tc>
+        <w:tc>
+          <w:tcPr>
+            <w:tcW w:type="dxa" w:w="1500"/>
+            <w:tcBorders>
+              <w:top w:val="single" w:color="C9D3DD" w:sz="4"/>
+              <w:left w:val="single" w:color="C9D3DD" w:sz="4"/>
+              <w:bottom w:val="single" w:color="C9D3DD" w:sz="4"/>
+              <w:right w:val="single" w:color="C9D3DD" w:sz="4"/>
+            </w:tcBorders>
+            <w:shd w:fill="0B1E33" w:color="auto" w:val="clear"/>
+            <w:tcMar>
+              <w:top w:type="dxa" w:w="50"/>
+              <w:left w:type="dxa" w:w="90"/>
+              <w:bottom w:type="dxa" w:w="50"/>
+              <w:right w:type="dxa" w:w="90"/>
+            </w:tcMar>
+            <w:vAlign w:val="center"/>
+          </w:tcPr>
+          <w:p>
+            <w:pPr>
+              <w:spacing w:after="0" w:line="252"/>
+              <w:jc w:val="right"/>
+            </w:pPr>
+            <w:r>
+              <w:rPr>
+                <w:rFonts w:ascii="Times New Roman" w:cs="Times New Roman" w:eastAsia="Times New Roman" w:hAnsi="Times New Roman"/>
+                <w:b/>
+                <w:bCs/>
+                <w:color w:val="FFFFFF"/>
+                <w:sz w:val="19"/>
+                <w:szCs w:val="19"/>
+              </w:rPr>
+              <w:t xml:space="preserve">kWh/yıl</w:t>
+            </w:r>
+          </w:p>
+        </w:tc>
+      </w:tr>
+      <w:tr>
+        <w:trPr>
+          <w:cantSplit/>
+        </w:trPr>
+        <w:tc>
+          <w:tcPr>
+            <w:tcW w:type="dxa" w:w="3500"/>
+            <w:tcBorders>
+              <w:top w:val="single" w:color="C9D3DD" w:sz="4"/>
+              <w:left w:val="single" w:color="C9D3DD" w:sz="4"/>
+              <w:bottom w:val="single" w:color="C9D3DD" w:sz="4"/>
+              <w:right w:val="single" w:color="C9D3DD" w:sz="4"/>
+            </w:tcBorders>
+            <w:tcMar>
+              <w:top w:type="dxa" w:w="50"/>
+              <w:left w:type="dxa" w:w="90"/>
+              <w:bottom w:type="dxa" w:w="50"/>
+              <w:right w:type="dxa" w:w="90"/>
+            </w:tcMar>
+            <w:vAlign w:val="center"/>
+          </w:tcPr>
+          <w:p>
+            <w:pPr>
+              <w:spacing w:after="0" w:line="252"/>
+              <w:jc w:val="left"/>
+            </w:pPr>
+            <w:r>
+              <w:rPr>
+                <w:rFonts w:ascii="Times New Roman" w:cs="Times New Roman" w:eastAsia="Times New Roman" w:hAnsi="Times New Roman"/>
+                <w:b w:val="false"/>
+                <w:bCs w:val="false"/>
+                <w:sz w:val="19"/>
+                <w:szCs w:val="19"/>
+              </w:rPr>
+              <w:t xml:space="preserve">İstasyon iklimlendirme ve bekleme (4 hücre)</w:t>
+            </w:r>
+          </w:p>
+        </w:tc>
+        <w:tc>
+          <w:tcPr>
+            <w:tcW w:type="dxa" w:w="3238"/>
+            <w:tcBorders>
+              <w:top w:val="single" w:color="C9D3DD" w:sz="4"/>
+              <w:left w:val="single" w:color="C9D3DD" w:sz="4"/>
+              <w:bottom w:val="single" w:color="C9D3DD" w:sz="4"/>
+              <w:right w:val="single" w:color="C9D3DD" w:sz="4"/>
+            </w:tcBorders>
+            <w:tcMar>
+              <w:top w:type="dxa" w:w="50"/>
+              <w:left w:type="dxa" w:w="90"/>
+              <w:bottom w:type="dxa" w:w="50"/>
+              <w:right w:type="dxa" w:w="90"/>
+            </w:tcMar>
+            <w:vAlign w:val="center"/>
+          </w:tcPr>
+          <w:p>
+            <w:pPr>
+              <w:spacing w:after="0" w:line="252"/>
+              <w:jc w:val="left"/>
+            </w:pPr>
+            <w:r>
+              <w:rPr>
+                <w:rFonts w:ascii="Times New Roman" w:cs="Times New Roman" w:eastAsia="Times New Roman" w:hAnsi="Times New Roman"/>
+                <w:b w:val="false"/>
+                <w:bCs w:val="false"/>
+                <w:sz w:val="19"/>
+                <w:szCs w:val="19"/>
+              </w:rPr>
+              <w:t xml:space="preserve">Ortalama 100 W / hücre</w:t>
+            </w:r>
+          </w:p>
+        </w:tc>
+        <w:tc>
+          <w:tcPr>
+            <w:tcW w:type="dxa" w:w="1400"/>
+            <w:tcBorders>
+              <w:top w:val="single" w:color="C9D3DD" w:sz="4"/>
+              <w:left w:val="single" w:color="C9D3DD" w:sz="4"/>
+              <w:bottom w:val="single" w:color="C9D3DD" w:sz="4"/>
+              <w:right w:val="single" w:color="C9D3DD" w:sz="4"/>
+            </w:tcBorders>
+            <w:tcMar>
+              <w:top w:type="dxa" w:w="50"/>
+              <w:left w:type="dxa" w:w="90"/>
+              <w:bottom w:type="dxa" w:w="50"/>
+              <w:right w:type="dxa" w:w="90"/>
+            </w:tcMar>
+            <w:vAlign w:val="center"/>
+          </w:tcPr>
+          <w:p>
+            <w:pPr>
+              <w:spacing w:after="0" w:line="252"/>
+              <w:jc w:val="right"/>
+            </w:pPr>
+            <w:r>
+              <w:rPr>
+                <w:rFonts w:ascii="Times New Roman" w:cs="Times New Roman" w:eastAsia="Times New Roman" w:hAnsi="Times New Roman"/>
+                <w:b w:val="false"/>
+                <w:bCs w:val="false"/>
+                <w:sz w:val="19"/>
+                <w:szCs w:val="19"/>
+              </w:rPr>
+              <w:t xml:space="preserve">9,6</w:t>
+            </w:r>
+          </w:p>
+        </w:tc>
+        <w:tc>
+          <w:tcPr>
+            <w:tcW w:type="dxa" w:w="1500"/>
+            <w:tcBorders>
+              <w:top w:val="single" w:color="C9D3DD" w:sz="4"/>
+              <w:left w:val="single" w:color="C9D3DD" w:sz="4"/>
+              <w:bottom w:val="single" w:color="C9D3DD" w:sz="4"/>
+              <w:right w:val="single" w:color="C9D3DD" w:sz="4"/>
+            </w:tcBorders>
+            <w:tcMar>
+              <w:top w:type="dxa" w:w="50"/>
+              <w:left w:type="dxa" w:w="90"/>
+              <w:bottom w:type="dxa" w:w="50"/>
+              <w:right w:type="dxa" w:w="90"/>
+            </w:tcMar>
+            <w:vAlign w:val="center"/>
+          </w:tcPr>
+          <w:p>
+            <w:pPr>
+              <w:spacing w:after="0" w:line="252"/>
+              <w:jc w:val="right"/>
+            </w:pPr>
+            <w:r>
+              <w:rPr>
+                <w:rFonts w:ascii="Times New Roman" w:cs="Times New Roman" w:eastAsia="Times New Roman" w:hAnsi="Times New Roman"/>
+                <w:b w:val="false"/>
+                <w:bCs w:val="false"/>
+                <w:sz w:val="19"/>
+                <w:szCs w:val="19"/>
+              </w:rPr>
+              <w:t xml:space="preserve">3.504</w:t>
+            </w:r>
+          </w:p>
+        </w:tc>
+      </w:tr>
+      <w:tr>
+        <w:trPr>
+          <w:cantSplit/>
+        </w:trPr>
+        <w:tc>
+          <w:tcPr>
+            <w:tcW w:type="dxa" w:w="3500"/>
+            <w:tcBorders>
+              <w:top w:val="single" w:color="C9D3DD" w:sz="4"/>
+              <w:left w:val="single" w:color="C9D3DD" w:sz="4"/>
+              <w:bottom w:val="single" w:color="C9D3DD" w:sz="4"/>
+              <w:right w:val="single" w:color="C9D3DD" w:sz="4"/>
+            </w:tcBorders>
+            <w:tcMar>
+              <w:top w:type="dxa" w:w="50"/>
+              <w:left w:type="dxa" w:w="90"/>
+              <w:bottom w:type="dxa" w:w="50"/>
+              <w:right w:type="dxa" w:w="90"/>
+            </w:tcMar>
+            <w:vAlign w:val="center"/>
+          </w:tcPr>
+          <w:p>
+            <w:pPr>
+              <w:spacing w:after="0" w:line="252"/>
+              <w:jc w:val="left"/>
+            </w:pPr>
+            <w:r>
+              <w:rPr>
+                <w:rFonts w:ascii="Times New Roman" w:cs="Times New Roman" w:eastAsia="Times New Roman" w:hAnsi="Times New Roman"/>
+                <w:b w:val="false"/>
+                <w:bCs w:val="false"/>
+                <w:sz w:val="19"/>
+                <w:szCs w:val="19"/>
+              </w:rPr>
+              <w:t xml:space="preserve">Kenar sunucu ve ağ</w:t>
+            </w:r>
+          </w:p>
+        </w:tc>
+        <w:tc>
+          <w:tcPr>
+            <w:tcW w:type="dxa" w:w="3238"/>
+            <w:tcBorders>
+              <w:top w:val="single" w:color="C9D3DD" w:sz="4"/>
+              <w:left w:val="single" w:color="C9D3DD" w:sz="4"/>
+              <w:bottom w:val="single" w:color="C9D3DD" w:sz="4"/>
+              <w:right w:val="single" w:color="C9D3DD" w:sz="4"/>
+            </w:tcBorders>
+            <w:tcMar>
+              <w:top w:type="dxa" w:w="50"/>
+              <w:left w:type="dxa" w:w="90"/>
+              <w:bottom w:type="dxa" w:w="50"/>
+              <w:right w:type="dxa" w:w="90"/>
+            </w:tcMar>
+            <w:vAlign w:val="center"/>
+          </w:tcPr>
+          <w:p>
+            <w:pPr>
+              <w:spacing w:after="0" w:line="252"/>
+              <w:jc w:val="left"/>
+            </w:pPr>
+            <w:r>
+              <w:rPr>
+                <w:rFonts w:ascii="Times New Roman" w:cs="Times New Roman" w:eastAsia="Times New Roman" w:hAnsi="Times New Roman"/>
+                <w:b w:val="false"/>
+                <w:bCs w:val="false"/>
+                <w:sz w:val="19"/>
+                <w:szCs w:val="19"/>
+              </w:rPr>
+              <w:t xml:space="preserve">Ortalama 150 W</w:t>
+            </w:r>
+          </w:p>
+        </w:tc>
+        <w:tc>
+          <w:tcPr>
+            <w:tcW w:type="dxa" w:w="1400"/>
+            <w:tcBorders>
+              <w:top w:val="single" w:color="C9D3DD" w:sz="4"/>
+              <w:left w:val="single" w:color="C9D3DD" w:sz="4"/>
+              <w:bottom w:val="single" w:color="C9D3DD" w:sz="4"/>
+              <w:right w:val="single" w:color="C9D3DD" w:sz="4"/>
+            </w:tcBorders>
+            <w:tcMar>
+              <w:top w:type="dxa" w:w="50"/>
+              <w:left w:type="dxa" w:w="90"/>
+              <w:bottom w:type="dxa" w:w="50"/>
+              <w:right w:type="dxa" w:w="90"/>
+            </w:tcMar>
+            <w:vAlign w:val="center"/>
+          </w:tcPr>
+          <w:p>
+            <w:pPr>
+              <w:spacing w:after="0" w:line="252"/>
+              <w:jc w:val="right"/>
+            </w:pPr>
+            <w:r>
+              <w:rPr>
+                <w:rFonts w:ascii="Times New Roman" w:cs="Times New Roman" w:eastAsia="Times New Roman" w:hAnsi="Times New Roman"/>
+                <w:b w:val="false"/>
+                <w:bCs w:val="false"/>
+                <w:sz w:val="19"/>
+                <w:szCs w:val="19"/>
+              </w:rPr>
+              <w:t xml:space="preserve">3,6</w:t>
+            </w:r>
+          </w:p>
+        </w:tc>
+        <w:tc>
+          <w:tcPr>
+            <w:tcW w:type="dxa" w:w="1500"/>
+            <w:tcBorders>
+              <w:top w:val="single" w:color="C9D3DD" w:sz="4"/>
+              <w:left w:val="single" w:color="C9D3DD" w:sz="4"/>
+              <w:bottom w:val="single" w:color="C9D3DD" w:sz="4"/>
+              <w:right w:val="single" w:color="C9D3DD" w:sz="4"/>
+            </w:tcBorders>
+            <w:tcMar>
+              <w:top w:type="dxa" w:w="50"/>
+              <w:left w:type="dxa" w:w="90"/>
+              <w:bottom w:type="dxa" w:w="50"/>
+              <w:right w:type="dxa" w:w="90"/>
+            </w:tcMar>
+            <w:vAlign w:val="center"/>
+          </w:tcPr>
+          <w:p>
+            <w:pPr>
+              <w:spacing w:after="0" w:line="252"/>
+              <w:jc w:val="right"/>
+            </w:pPr>
+            <w:r>
+              <w:rPr>
+                <w:rFonts w:ascii="Times New Roman" w:cs="Times New Roman" w:eastAsia="Times New Roman" w:hAnsi="Times New Roman"/>
+                <w:b w:val="false"/>
+                <w:bCs w:val="false"/>
+                <w:sz w:val="19"/>
+                <w:szCs w:val="19"/>
+              </w:rPr>
+              <w:t xml:space="preserve">1.314</w:t>
+            </w:r>
+          </w:p>
+        </w:tc>
+      </w:tr>
+      <w:tr>
+        <w:trPr>
+          <w:cantSplit/>
+        </w:trPr>
+        <w:tc>
+          <w:tcPr>
+            <w:tcW w:type="dxa" w:w="3500"/>
+            <w:tcBorders>
+              <w:top w:val="single" w:color="C9D3DD" w:sz="4"/>
+              <w:left w:val="single" w:color="C9D3DD" w:sz="4"/>
+              <w:bottom w:val="single" w:color="C9D3DD" w:sz="4"/>
+              <w:right w:val="single" w:color="C9D3DD" w:sz="4"/>
+            </w:tcBorders>
+            <w:tcMar>
+              <w:top w:type="dxa" w:w="50"/>
+              <w:left w:type="dxa" w:w="90"/>
+              <w:bottom w:type="dxa" w:w="50"/>
+              <w:right w:type="dxa" w:w="90"/>
+            </w:tcMar>
+            <w:vAlign w:val="center"/>
+          </w:tcPr>
+          <w:p>
+            <w:pPr>
+              <w:spacing w:after="0" w:line="252"/>
+              <w:jc w:val="left"/>
+            </w:pPr>
+            <w:r>
+              <w:rPr>
+                <w:rFonts w:ascii="Times New Roman" w:cs="Times New Roman" w:eastAsia="Times New Roman" w:hAnsi="Times New Roman"/>
+                <w:b w:val="false"/>
+                <w:bCs w:val="false"/>
+                <w:sz w:val="19"/>
+                <w:szCs w:val="19"/>
+              </w:rPr>
+              <w:t xml:space="preserve">Haberleşme ve aksesuarlar</w:t>
+            </w:r>
+          </w:p>
+        </w:tc>
+        <w:tc>
+          <w:tcPr>
+            <w:tcW w:type="dxa" w:w="3238"/>
+            <w:tcBorders>
+              <w:top w:val="single" w:color="C9D3DD" w:sz="4"/>
+              <w:left w:val="single" w:color="C9D3DD" w:sz="4"/>
+              <w:bottom w:val="single" w:color="C9D3DD" w:sz="4"/>
+              <w:right w:val="single" w:color="C9D3DD" w:sz="4"/>
+            </w:tcBorders>
+            <w:tcMar>
+              <w:top w:type="dxa" w:w="50"/>
+              <w:left w:type="dxa" w:w="90"/>
+              <w:bottom w:type="dxa" w:w="50"/>
+              <w:right w:type="dxa" w:w="90"/>
+            </w:tcMar>
+            <w:vAlign w:val="center"/>
+          </w:tcPr>
+          <w:p>
+            <w:pPr>
+              <w:spacing w:after="0" w:line="252"/>
+              <w:jc w:val="left"/>
+            </w:pPr>
+            <w:r>
+              <w:rPr>
+                <w:rFonts w:ascii="Times New Roman" w:cs="Times New Roman" w:eastAsia="Times New Roman" w:hAnsi="Times New Roman"/>
+                <w:b w:val="false"/>
+                <w:bCs w:val="false"/>
+                <w:sz w:val="19"/>
+                <w:szCs w:val="19"/>
+              </w:rPr>
+              <w:t xml:space="preserve">Ortalama 25 W</w:t>
+            </w:r>
+          </w:p>
+        </w:tc>
+        <w:tc>
+          <w:tcPr>
+            <w:tcW w:type="dxa" w:w="1400"/>
+            <w:tcBorders>
+              <w:top w:val="single" w:color="C9D3DD" w:sz="4"/>
+              <w:left w:val="single" w:color="C9D3DD" w:sz="4"/>
+              <w:bottom w:val="single" w:color="C9D3DD" w:sz="4"/>
+              <w:right w:val="single" w:color="C9D3DD" w:sz="4"/>
+            </w:tcBorders>
+            <w:tcMar>
+              <w:top w:type="dxa" w:w="50"/>
+              <w:left w:type="dxa" w:w="90"/>
+              <w:bottom w:type="dxa" w:w="50"/>
+              <w:right w:type="dxa" w:w="90"/>
+            </w:tcMar>
+            <w:vAlign w:val="center"/>
+          </w:tcPr>
+          <w:p>
+            <w:pPr>
+              <w:spacing w:after="0" w:line="252"/>
+              <w:jc w:val="right"/>
+            </w:pPr>
+            <w:r>
+              <w:rPr>
+                <w:rFonts w:ascii="Times New Roman" w:cs="Times New Roman" w:eastAsia="Times New Roman" w:hAnsi="Times New Roman"/>
+                <w:b w:val="false"/>
+                <w:bCs w:val="false"/>
+                <w:sz w:val="19"/>
+                <w:szCs w:val="19"/>
+              </w:rPr>
+              <w:t xml:space="preserve">0,6</w:t>
+            </w:r>
+          </w:p>
+        </w:tc>
+        <w:tc>
+          <w:tcPr>
+            <w:tcW w:type="dxa" w:w="1500"/>
+            <w:tcBorders>
+              <w:top w:val="single" w:color="C9D3DD" w:sz="4"/>
+              <w:left w:val="single" w:color="C9D3DD" w:sz="4"/>
+              <w:bottom w:val="single" w:color="C9D3DD" w:sz="4"/>
+              <w:right w:val="single" w:color="C9D3DD" w:sz="4"/>
+            </w:tcBorders>
+            <w:tcMar>
+              <w:top w:type="dxa" w:w="50"/>
+              <w:left w:type="dxa" w:w="90"/>
+              <w:bottom w:type="dxa" w:w="50"/>
+              <w:right w:type="dxa" w:w="90"/>
+            </w:tcMar>
+            <w:vAlign w:val="center"/>
+          </w:tcPr>
+          <w:p>
+            <w:pPr>
+              <w:spacing w:after="0" w:line="252"/>
+              <w:jc w:val="right"/>
+            </w:pPr>
+            <w:r>
+              <w:rPr>
+                <w:rFonts w:ascii="Times New Roman" w:cs="Times New Roman" w:eastAsia="Times New Roman" w:hAnsi="Times New Roman"/>
+                <w:b w:val="false"/>
+                <w:bCs w:val="false"/>
+                <w:sz w:val="19"/>
+                <w:szCs w:val="19"/>
+              </w:rPr>
+              <w:t xml:space="preserve">219</w:t>
+            </w:r>
+          </w:p>
+        </w:tc>
+      </w:tr>
+      <w:tr>
+        <w:trPr>
+          <w:cantSplit/>
+        </w:trPr>
+        <w:tc>
+          <w:tcPr>
+            <w:tcW w:type="dxa" w:w="3500"/>
+            <w:tcBorders>
+              <w:top w:val="single" w:color="C9D3DD" w:sz="4"/>
+              <w:left w:val="single" w:color="C9D3DD" w:sz="4"/>
+              <w:bottom w:val="single" w:color="C9D3DD" w:sz="4"/>
+              <w:right w:val="single" w:color="C9D3DD" w:sz="4"/>
+            </w:tcBorders>
+            <w:tcMar>
+              <w:top w:type="dxa" w:w="50"/>
+              <w:left w:type="dxa" w:w="90"/>
+              <w:bottom w:type="dxa" w:w="50"/>
+              <w:right w:type="dxa" w:w="90"/>
+            </w:tcMar>
+            <w:vAlign w:val="center"/>
+          </w:tcPr>
+          <w:p>
+            <w:pPr>
+              <w:spacing w:after="0" w:line="252"/>
+              <w:jc w:val="left"/>
+            </w:pPr>
+            <w:r>
+              <w:rPr>
+                <w:rFonts w:ascii="Times New Roman" w:cs="Times New Roman" w:eastAsia="Times New Roman" w:hAnsi="Times New Roman"/>
+                <w:b w:val="false"/>
+                <w:bCs w:val="false"/>
+                <w:sz w:val="19"/>
+                <w:szCs w:val="19"/>
+              </w:rPr>
+              <w:t xml:space="preserve">Nöbetçi direkleri (2 adet)</w:t>
+            </w:r>
+          </w:p>
+        </w:tc>
+        <w:tc>
+          <w:tcPr>
+            <w:tcW w:type="dxa" w:w="3238"/>
+            <w:tcBorders>
+              <w:top w:val="single" w:color="C9D3DD" w:sz="4"/>
+              <w:left w:val="single" w:color="C9D3DD" w:sz="4"/>
+              <w:bottom w:val="single" w:color="C9D3DD" w:sz="4"/>
+              <w:right w:val="single" w:color="C9D3DD" w:sz="4"/>
+            </w:tcBorders>
+            <w:tcMar>
+              <w:top w:type="dxa" w:w="50"/>
+              <w:left w:type="dxa" w:w="90"/>
+              <w:bottom w:type="dxa" w:w="50"/>
+              <w:right w:type="dxa" w:w="90"/>
+            </w:tcMar>
+            <w:vAlign w:val="center"/>
+          </w:tcPr>
+          <w:p>
+            <w:pPr>
+              <w:spacing w:after="0" w:line="252"/>
+              <w:jc w:val="left"/>
+            </w:pPr>
+            <w:r>
+              <w:rPr>
+                <w:rFonts w:ascii="Times New Roman" w:cs="Times New Roman" w:eastAsia="Times New Roman" w:hAnsi="Times New Roman"/>
+                <w:b w:val="false"/>
+                <w:bCs w:val="false"/>
+                <w:sz w:val="19"/>
+                <w:szCs w:val="19"/>
+              </w:rPr>
+              <w:t xml:space="preserve">20 W / direk (varsayım)</w:t>
+            </w:r>
+          </w:p>
+        </w:tc>
+        <w:tc>
+          <w:tcPr>
+            <w:tcW w:type="dxa" w:w="1400"/>
+            <w:tcBorders>
+              <w:top w:val="single" w:color="C9D3DD" w:sz="4"/>
+              <w:left w:val="single" w:color="C9D3DD" w:sz="4"/>
+              <w:bottom w:val="single" w:color="C9D3DD" w:sz="4"/>
+              <w:right w:val="single" w:color="C9D3DD" w:sz="4"/>
+            </w:tcBorders>
+            <w:tcMar>
+              <w:top w:type="dxa" w:w="50"/>
+              <w:left w:type="dxa" w:w="90"/>
+              <w:bottom w:type="dxa" w:w="50"/>
+              <w:right w:type="dxa" w:w="90"/>
+            </w:tcMar>
+            <w:vAlign w:val="center"/>
+          </w:tcPr>
+          <w:p>
+            <w:pPr>
+              <w:spacing w:after="0" w:line="252"/>
+              <w:jc w:val="right"/>
+            </w:pPr>
+            <w:r>
+              <w:rPr>
+                <w:rFonts w:ascii="Times New Roman" w:cs="Times New Roman" w:eastAsia="Times New Roman" w:hAnsi="Times New Roman"/>
+                <w:b w:val="false"/>
+                <w:bCs w:val="false"/>
+                <w:sz w:val="19"/>
+                <w:szCs w:val="19"/>
+              </w:rPr>
+              <w:t xml:space="preserve">0,96</w:t>
+            </w:r>
+          </w:p>
+        </w:tc>
+        <w:tc>
+          <w:tcPr>
+            <w:tcW w:type="dxa" w:w="1500"/>
+            <w:tcBorders>
+              <w:top w:val="single" w:color="C9D3DD" w:sz="4"/>
+              <w:left w:val="single" w:color="C9D3DD" w:sz="4"/>
+              <w:bottom w:val="single" w:color="C9D3DD" w:sz="4"/>
+              <w:right w:val="single" w:color="C9D3DD" w:sz="4"/>
+            </w:tcBorders>
+            <w:tcMar>
+              <w:top w:type="dxa" w:w="50"/>
+              <w:left w:type="dxa" w:w="90"/>
+              <w:bottom w:type="dxa" w:w="50"/>
+              <w:right w:type="dxa" w:w="90"/>
+            </w:tcMar>
+            <w:vAlign w:val="center"/>
+          </w:tcPr>
+          <w:p>
+            <w:pPr>
+              <w:spacing w:after="0" w:line="252"/>
+              <w:jc w:val="right"/>
+            </w:pPr>
+            <w:r>
+              <w:rPr>
+                <w:rFonts w:ascii="Times New Roman" w:cs="Times New Roman" w:eastAsia="Times New Roman" w:hAnsi="Times New Roman"/>
+                <w:b w:val="false"/>
+                <w:bCs w:val="false"/>
+                <w:sz w:val="19"/>
+                <w:szCs w:val="19"/>
+              </w:rPr>
+              <w:t xml:space="preserve">350</w:t>
+            </w:r>
+          </w:p>
+        </w:tc>
+      </w:tr>
+      <w:tr>
+        <w:trPr>
+          <w:cantSplit/>
+        </w:trPr>
+        <w:tc>
+          <w:tcPr>
+            <w:tcW w:type="dxa" w:w="3500"/>
+            <w:tcBorders>
+              <w:top w:val="single" w:color="C9D3DD" w:sz="4"/>
+              <w:left w:val="single" w:color="C9D3DD" w:sz="4"/>
+              <w:bottom w:val="single" w:color="C9D3DD" w:sz="4"/>
+              <w:right w:val="single" w:color="C9D3DD" w:sz="4"/>
+            </w:tcBorders>
+            <w:tcMar>
+              <w:top w:type="dxa" w:w="50"/>
+              <w:left w:type="dxa" w:w="90"/>
+              <w:bottom w:type="dxa" w:w="50"/>
+              <w:right w:type="dxa" w:w="90"/>
+            </w:tcMar>
+            <w:vAlign w:val="center"/>
+          </w:tcPr>
+          <w:p>
+            <w:pPr>
+              <w:spacing w:after="0" w:line="252"/>
+              <w:jc w:val="left"/>
+            </w:pPr>
+            <w:r>
+              <w:rPr>
+                <w:rFonts w:ascii="Times New Roman" w:cs="Times New Roman" w:eastAsia="Times New Roman" w:hAnsi="Times New Roman"/>
+                <w:b w:val="false"/>
+                <w:bCs w:val="false"/>
+                <w:sz w:val="19"/>
+                <w:szCs w:val="19"/>
+              </w:rPr>
+              <w:t xml:space="preserve">Kâşif şarjı</w:t>
+            </w:r>
+          </w:p>
+        </w:tc>
+        <w:tc>
+          <w:tcPr>
+            <w:tcW w:type="dxa" w:w="3238"/>
+            <w:tcBorders>
+              <w:top w:val="single" w:color="C9D3DD" w:sz="4"/>
+              <w:left w:val="single" w:color="C9D3DD" w:sz="4"/>
+              <w:bottom w:val="single" w:color="C9D3DD" w:sz="4"/>
+              <w:right w:val="single" w:color="C9D3DD" w:sz="4"/>
+            </w:tcBorders>
+            <w:tcMar>
+              <w:top w:type="dxa" w:w="50"/>
+              <w:left w:type="dxa" w:w="90"/>
+              <w:bottom w:type="dxa" w:w="50"/>
+              <w:right w:type="dxa" w:w="90"/>
+            </w:tcMar>
+            <w:vAlign w:val="center"/>
+          </w:tcPr>
+          <w:p>
+            <w:pPr>
+              <w:spacing w:after="0" w:line="252"/>
+              <w:jc w:val="left"/>
+            </w:pPr>
+            <w:r>
+              <w:rPr>
+                <w:rFonts w:ascii="Times New Roman" w:cs="Times New Roman" w:eastAsia="Times New Roman" w:hAnsi="Times New Roman"/>
+                <w:b w:val="false"/>
+                <w:bCs w:val="false"/>
+                <w:sz w:val="19"/>
+                <w:szCs w:val="19"/>
+              </w:rPr>
+              <w:t xml:space="preserve">Toplam tarama yolu değişmez</w:t>
+            </w:r>
+          </w:p>
+        </w:tc>
+        <w:tc>
+          <w:tcPr>
+            <w:tcW w:type="dxa" w:w="1400"/>
+            <w:tcBorders>
+              <w:top w:val="single" w:color="C9D3DD" w:sz="4"/>
+              <w:left w:val="single" w:color="C9D3DD" w:sz="4"/>
+              <w:bottom w:val="single" w:color="C9D3DD" w:sz="4"/>
+              <w:right w:val="single" w:color="C9D3DD" w:sz="4"/>
+            </w:tcBorders>
+            <w:tcMar>
+              <w:top w:type="dxa" w:w="50"/>
+              <w:left w:type="dxa" w:w="90"/>
+              <w:bottom w:type="dxa" w:w="50"/>
+              <w:right w:type="dxa" w:w="90"/>
+            </w:tcMar>
+            <w:vAlign w:val="center"/>
+          </w:tcPr>
+          <w:p>
+            <w:pPr>
+              <w:spacing w:after="0" w:line="252"/>
+              <w:jc w:val="right"/>
+            </w:pPr>
+            <w:r>
+              <w:rPr>
+                <w:rFonts w:ascii="Times New Roman" w:cs="Times New Roman" w:eastAsia="Times New Roman" w:hAnsi="Times New Roman"/>
+                <w:b w:val="false"/>
+                <w:bCs w:val="false"/>
+                <w:sz w:val="19"/>
+                <w:szCs w:val="19"/>
+              </w:rPr>
+              <w:t xml:space="preserve">1,0</w:t>
+            </w:r>
+          </w:p>
+        </w:tc>
+        <w:tc>
+          <w:tcPr>
+            <w:tcW w:type="dxa" w:w="1500"/>
+            <w:tcBorders>
+              <w:top w:val="single" w:color="C9D3DD" w:sz="4"/>
+              <w:left w:val="single" w:color="C9D3DD" w:sz="4"/>
+              <w:bottom w:val="single" w:color="C9D3DD" w:sz="4"/>
+              <w:right w:val="single" w:color="C9D3DD" w:sz="4"/>
+            </w:tcBorders>
+            <w:tcMar>
+              <w:top w:type="dxa" w:w="50"/>
+              <w:left w:type="dxa" w:w="90"/>
+              <w:bottom w:type="dxa" w:w="50"/>
+              <w:right w:type="dxa" w:w="90"/>
+            </w:tcMar>
+            <w:vAlign w:val="center"/>
+          </w:tcPr>
+          <w:p>
+            <w:pPr>
+              <w:spacing w:after="0" w:line="252"/>
+              <w:jc w:val="right"/>
+            </w:pPr>
+            <w:r>
+              <w:rPr>
+                <w:rFonts w:ascii="Times New Roman" w:cs="Times New Roman" w:eastAsia="Times New Roman" w:hAnsi="Times New Roman"/>
+                <w:b w:val="false"/>
+                <w:bCs w:val="false"/>
+                <w:sz w:val="19"/>
+                <w:szCs w:val="19"/>
+              </w:rPr>
+              <w:t xml:space="preserve">365</w:t>
+            </w:r>
+          </w:p>
+        </w:tc>
+      </w:tr>
+      <w:tr>
+        <w:trPr>
+          <w:cantSplit/>
+        </w:trPr>
+        <w:tc>
+          <w:tcPr>
+            <w:tcW w:type="dxa" w:w="3500"/>
+            <w:tcBorders>
+              <w:top w:val="single" w:color="C9D3DD" w:sz="4"/>
+              <w:left w:val="single" w:color="C9D3DD" w:sz="4"/>
+              <w:bottom w:val="single" w:color="C9D3DD" w:sz="4"/>
+              <w:right w:val="single" w:color="C9D3DD" w:sz="4"/>
+            </w:tcBorders>
+            <w:tcMar>
+              <w:top w:type="dxa" w:w="50"/>
+              <w:left w:type="dxa" w:w="90"/>
+              <w:bottom w:type="dxa" w:w="50"/>
+              <w:right w:type="dxa" w:w="90"/>
+            </w:tcMar>
+            <w:vAlign w:val="center"/>
+          </w:tcPr>
+          <w:p>
+            <w:pPr>
+              <w:spacing w:after="0" w:line="252"/>
+              <w:jc w:val="left"/>
+            </w:pPr>
+            <w:r>
+              <w:rPr>
+                <w:rFonts w:ascii="Times New Roman" w:cs="Times New Roman" w:eastAsia="Times New Roman" w:hAnsi="Times New Roman"/>
+                <w:b w:val="false"/>
+                <w:bCs w:val="false"/>
+                <w:sz w:val="19"/>
+                <w:szCs w:val="19"/>
+              </w:rPr>
+              <w:t xml:space="preserve">Bekçi ve işçi şarjı</w:t>
+            </w:r>
+          </w:p>
+        </w:tc>
+        <w:tc>
+          <w:tcPr>
+            <w:tcW w:type="dxa" w:w="3238"/>
+            <w:tcBorders>
+              <w:top w:val="single" w:color="C9D3DD" w:sz="4"/>
+              <w:left w:val="single" w:color="C9D3DD" w:sz="4"/>
+              <w:bottom w:val="single" w:color="C9D3DD" w:sz="4"/>
+              <w:right w:val="single" w:color="C9D3DD" w:sz="4"/>
+            </w:tcBorders>
+            <w:tcMar>
+              <w:top w:type="dxa" w:w="50"/>
+              <w:left w:type="dxa" w:w="90"/>
+              <w:bottom w:type="dxa" w:w="50"/>
+              <w:right w:type="dxa" w:w="90"/>
+            </w:tcMar>
+            <w:vAlign w:val="center"/>
+          </w:tcPr>
+          <w:p>
+            <w:pPr>
+              <w:spacing w:after="0" w:line="252"/>
+              <w:jc w:val="left"/>
+            </w:pPr>
+            <w:r>
+              <w:rPr>
+                <w:rFonts w:ascii="Times New Roman" w:cs="Times New Roman" w:eastAsia="Times New Roman" w:hAnsi="Times New Roman"/>
+                <w:b w:val="false"/>
+                <w:bCs w:val="false"/>
+                <w:sz w:val="19"/>
+                <w:szCs w:val="19"/>
+              </w:rPr>
+              <w:t xml:space="preserve">≈6 sorti/gün × ≈0,05 kWh</w:t>
+            </w:r>
+          </w:p>
+        </w:tc>
+        <w:tc>
+          <w:tcPr>
+            <w:tcW w:type="dxa" w:w="1400"/>
+            <w:tcBorders>
+              <w:top w:val="single" w:color="C9D3DD" w:sz="4"/>
+              <w:left w:val="single" w:color="C9D3DD" w:sz="4"/>
+              <w:bottom w:val="single" w:color="C9D3DD" w:sz="4"/>
+              <w:right w:val="single" w:color="C9D3DD" w:sz="4"/>
+            </w:tcBorders>
+            <w:tcMar>
+              <w:top w:type="dxa" w:w="50"/>
+              <w:left w:type="dxa" w:w="90"/>
+              <w:bottom w:type="dxa" w:w="50"/>
+              <w:right w:type="dxa" w:w="90"/>
+            </w:tcMar>
+            <w:vAlign w:val="center"/>
+          </w:tcPr>
+          <w:p>
+            <w:pPr>
+              <w:spacing w:after="0" w:line="252"/>
+              <w:jc w:val="right"/>
+            </w:pPr>
+            <w:r>
+              <w:rPr>
+                <w:rFonts w:ascii="Times New Roman" w:cs="Times New Roman" w:eastAsia="Times New Roman" w:hAnsi="Times New Roman"/>
+                <w:b w:val="false"/>
+                <w:bCs w:val="false"/>
+                <w:sz w:val="19"/>
+                <w:szCs w:val="19"/>
+              </w:rPr>
+              <w:t xml:space="preserve">0,3</w:t>
+            </w:r>
+          </w:p>
+        </w:tc>
+        <w:tc>
+          <w:tcPr>
+            <w:tcW w:type="dxa" w:w="1500"/>
+            <w:tcBorders>
+              <w:top w:val="single" w:color="C9D3DD" w:sz="4"/>
+              <w:left w:val="single" w:color="C9D3DD" w:sz="4"/>
+              <w:bottom w:val="single" w:color="C9D3DD" w:sz="4"/>
+              <w:right w:val="single" w:color="C9D3DD" w:sz="4"/>
+            </w:tcBorders>
+            <w:tcMar>
+              <w:top w:type="dxa" w:w="50"/>
+              <w:left w:type="dxa" w:w="90"/>
+              <w:bottom w:type="dxa" w:w="50"/>
+              <w:right w:type="dxa" w:w="90"/>
+            </w:tcMar>
+            <w:vAlign w:val="center"/>
+          </w:tcPr>
+          <w:p>
+            <w:pPr>
+              <w:spacing w:after="0" w:line="252"/>
+              <w:jc w:val="right"/>
+            </w:pPr>
+            <w:r>
+              <w:rPr>
+                <w:rFonts w:ascii="Times New Roman" w:cs="Times New Roman" w:eastAsia="Times New Roman" w:hAnsi="Times New Roman"/>
+                <w:b w:val="false"/>
+                <w:bCs w:val="false"/>
+                <w:sz w:val="19"/>
+                <w:szCs w:val="19"/>
+              </w:rPr>
+              <w:t xml:space="preserve">110</w:t>
+            </w:r>
+          </w:p>
+        </w:tc>
+      </w:tr>
+      <w:tr>
+        <w:trPr>
+          <w:cantSplit/>
+        </w:trPr>
+        <w:tc>
+          <w:tcPr>
+            <w:tcW w:type="dxa" w:w="3500"/>
+            <w:tcBorders>
+              <w:top w:val="single" w:color="C9D3DD" w:sz="4"/>
+              <w:left w:val="single" w:color="C9D3DD" w:sz="4"/>
+              <w:bottom w:val="single" w:color="C9D3DD" w:sz="4"/>
+              <w:right w:val="single" w:color="C9D3DD" w:sz="4"/>
+            </w:tcBorders>
+            <w:shd w:fill="EEF3F8" w:color="auto" w:val="clear"/>
+            <w:tcMar>
+              <w:top w:type="dxa" w:w="50"/>
+              <w:left w:type="dxa" w:w="90"/>
+              <w:bottom w:type="dxa" w:w="50"/>
+              <w:right w:type="dxa" w:w="90"/>
+            </w:tcMar>
+            <w:vAlign w:val="center"/>
+          </w:tcPr>
+          <w:p>
+            <w:pPr>
+              <w:spacing w:after="0" w:line="252"/>
+              <w:jc w:val="left"/>
+            </w:pPr>
+            <w:r>
+              <w:rPr>
+                <w:rFonts w:ascii="Times New Roman" w:cs="Times New Roman" w:eastAsia="Times New Roman" w:hAnsi="Times New Roman"/>
+                <w:b/>
+                <w:bCs/>
+                <w:sz w:val="19"/>
+                <w:szCs w:val="19"/>
+              </w:rPr>
+              <w:t xml:space="preserve">Toplam tüketim</w:t>
+            </w:r>
+          </w:p>
+        </w:tc>
+        <w:tc>
+          <w:tcPr>
+            <w:tcW w:type="dxa" w:w="3238"/>
+            <w:tcBorders>
+              <w:top w:val="single" w:color="C9D3DD" w:sz="4"/>
+              <w:left w:val="single" w:color="C9D3DD" w:sz="4"/>
+              <w:bottom w:val="single" w:color="C9D3DD" w:sz="4"/>
+              <w:right w:val="single" w:color="C9D3DD" w:sz="4"/>
+            </w:tcBorders>
+            <w:shd w:fill="EEF3F8" w:color="auto" w:val="clear"/>
+            <w:tcMar>
+              <w:top w:type="dxa" w:w="50"/>
+              <w:left w:type="dxa" w:w="90"/>
+              <w:bottom w:type="dxa" w:w="50"/>
+              <w:right w:type="dxa" w:w="90"/>
+            </w:tcMar>
+            <w:vAlign w:val="center"/>
+          </w:tcPr>
+          <w:p>
+            <w:pPr>
+              <w:spacing w:after="0" w:line="252"/>
+              <w:jc w:val="left"/>
+            </w:pPr>
+            <w:r>
+              <w:rPr>
+                <w:rFonts w:ascii="Times New Roman" w:cs="Times New Roman" w:eastAsia="Times New Roman" w:hAnsi="Times New Roman"/>
+                <w:sz w:val="19"/>
+                <w:szCs w:val="19"/>
+              </w:rPr>
+              <w:t xml:space="preserve"/>
+            </w:r>
+          </w:p>
+        </w:tc>
+        <w:tc>
+          <w:tcPr>
+            <w:tcW w:type="dxa" w:w="1400"/>
+            <w:tcBorders>
+              <w:top w:val="single" w:color="C9D3DD" w:sz="4"/>
+              <w:left w:val="single" w:color="C9D3DD" w:sz="4"/>
+              <w:bottom w:val="single" w:color="C9D3DD" w:sz="4"/>
+              <w:right w:val="single" w:color="C9D3DD" w:sz="4"/>
+            </w:tcBorders>
+            <w:shd w:fill="EEF3F8" w:color="auto" w:val="clear"/>
+            <w:tcMar>
+              <w:top w:type="dxa" w:w="50"/>
+              <w:left w:type="dxa" w:w="90"/>
+              <w:bottom w:type="dxa" w:w="50"/>
+              <w:right w:type="dxa" w:w="90"/>
+            </w:tcMar>
+            <w:vAlign w:val="center"/>
+          </w:tcPr>
+          <w:p>
+            <w:pPr>
+              <w:spacing w:after="0" w:line="252"/>
+              <w:jc w:val="right"/>
+            </w:pPr>
+            <w:r>
+              <w:rPr>
+                <w:rFonts w:ascii="Times New Roman" w:cs="Times New Roman" w:eastAsia="Times New Roman" w:hAnsi="Times New Roman"/>
+                <w:b/>
+                <w:bCs/>
+                <w:sz w:val="19"/>
+                <w:szCs w:val="19"/>
+              </w:rPr>
+              <w:t xml:space="preserve">≈16,1</w:t>
+            </w:r>
+          </w:p>
+        </w:tc>
+        <w:tc>
+          <w:tcPr>
+            <w:tcW w:type="dxa" w:w="1500"/>
+            <w:tcBorders>
+              <w:top w:val="single" w:color="C9D3DD" w:sz="4"/>
+              <w:left w:val="single" w:color="C9D3DD" w:sz="4"/>
+              <w:bottom w:val="single" w:color="C9D3DD" w:sz="4"/>
+              <w:right w:val="single" w:color="C9D3DD" w:sz="4"/>
+            </w:tcBorders>
+            <w:shd w:fill="EEF3F8" w:color="auto" w:val="clear"/>
+            <w:tcMar>
+              <w:top w:type="dxa" w:w="50"/>
+              <w:left w:type="dxa" w:w="90"/>
+              <w:bottom w:type="dxa" w:w="50"/>
+              <w:right w:type="dxa" w:w="90"/>
+            </w:tcMar>
+            <w:vAlign w:val="center"/>
+          </w:tcPr>
+          <w:p>
+            <w:pPr>
+              <w:spacing w:after="0" w:line="252"/>
+              <w:jc w:val="right"/>
+            </w:pPr>
+            <w:r>
+              <w:rPr>
+                <w:rFonts w:ascii="Times New Roman" w:cs="Times New Roman" w:eastAsia="Times New Roman" w:hAnsi="Times New Roman"/>
+                <w:b/>
+                <w:bCs/>
+                <w:sz w:val="19"/>
+                <w:szCs w:val="19"/>
+              </w:rPr>
+              <w:t xml:space="preserve">≈5.860</w:t>
+            </w:r>
+          </w:p>
+        </w:tc>
+      </w:tr>
+      <w:tr>
+        <w:trPr>
+          <w:cantSplit/>
+        </w:trPr>
+        <w:tc>
+          <w:tcPr>
+            <w:tcW w:type="dxa" w:w="3500"/>
+            <w:tcBorders>
+              <w:top w:val="single" w:color="C9D3DD" w:sz="4"/>
+              <w:left w:val="single" w:color="C9D3DD" w:sz="4"/>
+              <w:bottom w:val="single" w:color="C9D3DD" w:sz="4"/>
+              <w:right w:val="single" w:color="C9D3DD" w:sz="4"/>
+            </w:tcBorders>
+            <w:shd w:fill="EEF3F8" w:color="auto" w:val="clear"/>
+            <w:tcMar>
+              <w:top w:type="dxa" w:w="50"/>
+              <w:left w:type="dxa" w:w="90"/>
+              <w:bottom w:type="dxa" w:w="50"/>
+              <w:right w:type="dxa" w:w="90"/>
+            </w:tcMar>
+            <w:vAlign w:val="center"/>
+          </w:tcPr>
+          <w:p>
+            <w:pPr>
+              <w:spacing w:after="0" w:line="252"/>
+              <w:jc w:val="left"/>
+            </w:pPr>
+            <w:r>
+              <w:rPr>
+                <w:rFonts w:ascii="Times New Roman" w:cs="Times New Roman" w:eastAsia="Times New Roman" w:hAnsi="Times New Roman"/>
+                <w:b/>
+                <w:bCs/>
+                <w:sz w:val="19"/>
+                <w:szCs w:val="19"/>
+              </w:rPr>
+              <w:t xml:space="preserve">Tasarım yükü</w:t>
+            </w:r>
+          </w:p>
+        </w:tc>
+        <w:tc>
+          <w:tcPr>
+            <w:tcW w:type="dxa" w:w="3238"/>
+            <w:tcBorders>
+              <w:top w:val="single" w:color="C9D3DD" w:sz="4"/>
+              <w:left w:val="single" w:color="C9D3DD" w:sz="4"/>
+              <w:bottom w:val="single" w:color="C9D3DD" w:sz="4"/>
+              <w:right w:val="single" w:color="C9D3DD" w:sz="4"/>
+            </w:tcBorders>
+            <w:shd w:fill="EEF3F8" w:color="auto" w:val="clear"/>
+            <w:tcMar>
+              <w:top w:type="dxa" w:w="50"/>
+              <w:left w:type="dxa" w:w="90"/>
+              <w:bottom w:type="dxa" w:w="50"/>
+              <w:right w:type="dxa" w:w="90"/>
+            </w:tcMar>
+            <w:vAlign w:val="center"/>
+          </w:tcPr>
+          <w:p>
+            <w:pPr>
+              <w:spacing w:after="0" w:line="252"/>
+              <w:jc w:val="left"/>
+            </w:pPr>
+            <w:r>
+              <w:rPr>
+                <w:rFonts w:ascii="Times New Roman" w:cs="Times New Roman" w:eastAsia="Times New Roman" w:hAnsi="Times New Roman"/>
+                <w:b/>
+                <w:bCs/>
+                <w:sz w:val="19"/>
+                <w:szCs w:val="19"/>
+              </w:rPr>
+              <w:t xml:space="preserve">%30 güvenlik payı</w:t>
+            </w:r>
+          </w:p>
+        </w:tc>
+        <w:tc>
+          <w:tcPr>
+            <w:tcW w:type="dxa" w:w="1400"/>
+            <w:tcBorders>
+              <w:top w:val="single" w:color="C9D3DD" w:sz="4"/>
+              <w:left w:val="single" w:color="C9D3DD" w:sz="4"/>
+              <w:bottom w:val="single" w:color="C9D3DD" w:sz="4"/>
+              <w:right w:val="single" w:color="C9D3DD" w:sz="4"/>
+            </w:tcBorders>
+            <w:shd w:fill="EEF3F8" w:color="auto" w:val="clear"/>
+            <w:tcMar>
+              <w:top w:type="dxa" w:w="50"/>
+              <w:left w:type="dxa" w:w="90"/>
+              <w:bottom w:type="dxa" w:w="50"/>
+              <w:right w:type="dxa" w:w="90"/>
+            </w:tcMar>
+            <w:vAlign w:val="center"/>
+          </w:tcPr>
+          <w:p>
+            <w:pPr>
+              <w:spacing w:after="0" w:line="252"/>
+              <w:jc w:val="right"/>
+            </w:pPr>
+            <w:r>
+              <w:rPr>
+                <w:rFonts w:ascii="Times New Roman" w:cs="Times New Roman" w:eastAsia="Times New Roman" w:hAnsi="Times New Roman"/>
+                <w:b/>
+                <w:bCs/>
+                <w:sz w:val="19"/>
+                <w:szCs w:val="19"/>
+              </w:rPr>
+              <w:t xml:space="preserve">≈20,9</w:t>
+            </w:r>
+          </w:p>
+        </w:tc>
+        <w:tc>
+          <w:tcPr>
+            <w:tcW w:type="dxa" w:w="1500"/>
+            <w:tcBorders>
+              <w:top w:val="single" w:color="C9D3DD" w:sz="4"/>
+              <w:left w:val="single" w:color="C9D3DD" w:sz="4"/>
+              <w:bottom w:val="single" w:color="C9D3DD" w:sz="4"/>
+              <w:right w:val="single" w:color="C9D3DD" w:sz="4"/>
+            </w:tcBorders>
+            <w:shd w:fill="EEF3F8" w:color="auto" w:val="clear"/>
+            <w:tcMar>
+              <w:top w:type="dxa" w:w="50"/>
+              <w:left w:type="dxa" w:w="90"/>
+              <w:bottom w:type="dxa" w:w="50"/>
+              <w:right w:type="dxa" w:w="90"/>
+            </w:tcMar>
+            <w:vAlign w:val="center"/>
+          </w:tcPr>
+          <w:p>
+            <w:pPr>
+              <w:spacing w:after="0" w:line="252"/>
+              <w:jc w:val="right"/>
+            </w:pPr>
+            <w:r>
+              <w:rPr>
+                <w:rFonts w:ascii="Times New Roman" w:cs="Times New Roman" w:eastAsia="Times New Roman" w:hAnsi="Times New Roman"/>
+                <w:b/>
+                <w:bCs/>
+                <w:sz w:val="19"/>
+                <w:szCs w:val="19"/>
+              </w:rPr>
+              <w:t xml:space="preserve">≈7.620</w:t>
+            </w:r>
+          </w:p>
+        </w:tc>
+      </w:tr>
+      <w:tr>
+        <w:trPr>
+          <w:cantSplit/>
+        </w:trPr>
+        <w:tc>
+          <w:tcPr>
+            <w:tcW w:type="dxa" w:w="3500"/>
+            <w:tcBorders>
+              <w:top w:val="single" w:color="C9D3DD" w:sz="4"/>
+              <w:left w:val="single" w:color="C9D3DD" w:sz="4"/>
+              <w:bottom w:val="single" w:color="C9D3DD" w:sz="4"/>
+              <w:right w:val="single" w:color="C9D3DD" w:sz="4"/>
+            </w:tcBorders>
+            <w:tcMar>
+              <w:top w:type="dxa" w:w="50"/>
+              <w:left w:type="dxa" w:w="90"/>
+              <w:bottom w:type="dxa" w:w="50"/>
+              <w:right w:type="dxa" w:w="90"/>
+            </w:tcMar>
+            <w:vAlign w:val="center"/>
+          </w:tcPr>
+          <w:p>
+            <w:pPr>
+              <w:spacing w:after="0" w:line="252"/>
+              <w:jc w:val="left"/>
+            </w:pPr>
+            <w:r>
+              <w:rPr>
+                <w:rFonts w:ascii="Times New Roman" w:cs="Times New Roman" w:eastAsia="Times New Roman" w:hAnsi="Times New Roman"/>
+                <w:b w:val="false"/>
+                <w:bCs w:val="false"/>
+                <w:sz w:val="19"/>
+                <w:szCs w:val="19"/>
+              </w:rPr>
+              <w:t xml:space="preserve">Güneş paneli 6 kWp</w:t>
+            </w:r>
+          </w:p>
+        </w:tc>
+        <w:tc>
+          <w:tcPr>
+            <w:tcW w:type="dxa" w:w="3238"/>
+            <w:tcBorders>
+              <w:top w:val="single" w:color="C9D3DD" w:sz="4"/>
+              <w:left w:val="single" w:color="C9D3DD" w:sz="4"/>
+              <w:bottom w:val="single" w:color="C9D3DD" w:sz="4"/>
+              <w:right w:val="single" w:color="C9D3DD" w:sz="4"/>
+            </w:tcBorders>
+            <w:tcMar>
+              <w:top w:type="dxa" w:w="50"/>
+              <w:left w:type="dxa" w:w="90"/>
+              <w:bottom w:type="dxa" w:w="50"/>
+              <w:right w:type="dxa" w:w="90"/>
+            </w:tcMar>
+            <w:vAlign w:val="center"/>
+          </w:tcPr>
+          <w:p>
+            <w:pPr>
+              <w:spacing w:after="0" w:line="252"/>
+              <w:jc w:val="left"/>
+            </w:pPr>
+            <w:r>
+              <w:rPr>
+                <w:rFonts w:ascii="Times New Roman" w:cs="Times New Roman" w:eastAsia="Times New Roman" w:hAnsi="Times New Roman"/>
+                <w:b w:val="false"/>
+                <w:bCs w:val="false"/>
+                <w:sz w:val="19"/>
+                <w:szCs w:val="19"/>
+              </w:rPr>
+              <w:t xml:space="preserve">≈1.350 kWh/kWp·yıl (temkinli)</w:t>
+            </w:r>
+          </w:p>
+        </w:tc>
+        <w:tc>
+          <w:tcPr>
+            <w:tcW w:type="dxa" w:w="1400"/>
+            <w:tcBorders>
+              <w:top w:val="single" w:color="C9D3DD" w:sz="4"/>
+              <w:left w:val="single" w:color="C9D3DD" w:sz="4"/>
+              <w:bottom w:val="single" w:color="C9D3DD" w:sz="4"/>
+              <w:right w:val="single" w:color="C9D3DD" w:sz="4"/>
+            </w:tcBorders>
+            <w:tcMar>
+              <w:top w:type="dxa" w:w="50"/>
+              <w:left w:type="dxa" w:w="90"/>
+              <w:bottom w:type="dxa" w:w="50"/>
+              <w:right w:type="dxa" w:w="90"/>
+            </w:tcMar>
+            <w:vAlign w:val="center"/>
+          </w:tcPr>
+          <w:p>
+            <w:pPr>
+              <w:spacing w:after="0" w:line="252"/>
+              <w:jc w:val="right"/>
+            </w:pPr>
+            <w:r>
+              <w:rPr>
+                <w:rFonts w:ascii="Times New Roman" w:cs="Times New Roman" w:eastAsia="Times New Roman" w:hAnsi="Times New Roman"/>
+                <w:b w:val="false"/>
+                <w:bCs w:val="false"/>
+                <w:sz w:val="19"/>
+                <w:szCs w:val="19"/>
+              </w:rPr>
+              <w:t xml:space="preserve">≈22,2</w:t>
+            </w:r>
+          </w:p>
+        </w:tc>
+        <w:tc>
+          <w:tcPr>
+            <w:tcW w:type="dxa" w:w="1500"/>
+            <w:tcBorders>
+              <w:top w:val="single" w:color="C9D3DD" w:sz="4"/>
+              <w:left w:val="single" w:color="C9D3DD" w:sz="4"/>
+              <w:bottom w:val="single" w:color="C9D3DD" w:sz="4"/>
+              <w:right w:val="single" w:color="C9D3DD" w:sz="4"/>
+            </w:tcBorders>
+            <w:tcMar>
+              <w:top w:type="dxa" w:w="50"/>
+              <w:left w:type="dxa" w:w="90"/>
+              <w:bottom w:type="dxa" w:w="50"/>
+              <w:right w:type="dxa" w:w="90"/>
+            </w:tcMar>
+            <w:vAlign w:val="center"/>
+          </w:tcPr>
+          <w:p>
+            <w:pPr>
+              <w:spacing w:after="0" w:line="252"/>
+              <w:jc w:val="right"/>
+            </w:pPr>
+            <w:r>
+              <w:rPr>
+                <w:rFonts w:ascii="Times New Roman" w:cs="Times New Roman" w:eastAsia="Times New Roman" w:hAnsi="Times New Roman"/>
+                <w:b w:val="false"/>
+                <w:bCs w:val="false"/>
+                <w:sz w:val="19"/>
+                <w:szCs w:val="19"/>
+              </w:rPr>
+              <w:t xml:space="preserve">8.100</w:t>
+            </w:r>
+          </w:p>
+        </w:tc>
+      </w:tr>
+      <w:tr>
+        <w:trPr>
+          <w:cantSplit/>
+        </w:trPr>
+        <w:tc>
+          <w:tcPr>
+            <w:tcW w:type="dxa" w:w="3500"/>
+            <w:tcBorders>
+              <w:top w:val="single" w:color="C9D3DD" w:sz="4"/>
+              <w:left w:val="single" w:color="C9D3DD" w:sz="4"/>
+              <w:bottom w:val="single" w:color="C9D3DD" w:sz="4"/>
+              <w:right w:val="single" w:color="C9D3DD" w:sz="4"/>
+            </w:tcBorders>
+            <w:tcMar>
+              <w:top w:type="dxa" w:w="50"/>
+              <w:left w:type="dxa" w:w="90"/>
+              <w:bottom w:type="dxa" w:w="50"/>
+              <w:right w:type="dxa" w:w="90"/>
+            </w:tcMar>
+            <w:vAlign w:val="center"/>
+          </w:tcPr>
+          <w:p>
+            <w:pPr>
+              <w:spacing w:after="0" w:line="252"/>
+              <w:jc w:val="left"/>
+            </w:pPr>
+            <w:r>
+              <w:rPr>
+                <w:rFonts w:ascii="Times New Roman" w:cs="Times New Roman" w:eastAsia="Times New Roman" w:hAnsi="Times New Roman"/>
+                <w:b w:val="false"/>
+                <w:bCs w:val="false"/>
+                <w:sz w:val="19"/>
+                <w:szCs w:val="19"/>
+              </w:rPr>
+              <w:t xml:space="preserve">Dikey eksenli türbin 3 kW</w:t>
+            </w:r>
+          </w:p>
+        </w:tc>
+        <w:tc>
+          <w:tcPr>
+            <w:tcW w:type="dxa" w:w="3238"/>
+            <w:tcBorders>
+              <w:top w:val="single" w:color="C9D3DD" w:sz="4"/>
+              <w:left w:val="single" w:color="C9D3DD" w:sz="4"/>
+              <w:bottom w:val="single" w:color="C9D3DD" w:sz="4"/>
+              <w:right w:val="single" w:color="C9D3DD" w:sz="4"/>
+            </w:tcBorders>
+            <w:tcMar>
+              <w:top w:type="dxa" w:w="50"/>
+              <w:left w:type="dxa" w:w="90"/>
+              <w:bottom w:type="dxa" w:w="50"/>
+              <w:right w:type="dxa" w:w="90"/>
+            </w:tcMar>
+            <w:vAlign w:val="center"/>
+          </w:tcPr>
+          <w:p>
+            <w:pPr>
+              <w:spacing w:after="0" w:line="252"/>
+              <w:jc w:val="left"/>
+            </w:pPr>
+            <w:r>
+              <w:rPr>
+                <w:rFonts w:ascii="Times New Roman" w:cs="Times New Roman" w:eastAsia="Times New Roman" w:hAnsi="Times New Roman"/>
+                <w:b w:val="false"/>
+                <w:bCs w:val="false"/>
+                <w:sz w:val="19"/>
+                <w:szCs w:val="19"/>
+              </w:rPr>
+              <w:t xml:space="preserve">Kapasite faktörü %12</w:t>
+            </w:r>
+          </w:p>
+        </w:tc>
+        <w:tc>
+          <w:tcPr>
+            <w:tcW w:type="dxa" w:w="1400"/>
+            <w:tcBorders>
+              <w:top w:val="single" w:color="C9D3DD" w:sz="4"/>
+              <w:left w:val="single" w:color="C9D3DD" w:sz="4"/>
+              <w:bottom w:val="single" w:color="C9D3DD" w:sz="4"/>
+              <w:right w:val="single" w:color="C9D3DD" w:sz="4"/>
+            </w:tcBorders>
+            <w:tcMar>
+              <w:top w:type="dxa" w:w="50"/>
+              <w:left w:type="dxa" w:w="90"/>
+              <w:bottom w:type="dxa" w:w="50"/>
+              <w:right w:type="dxa" w:w="90"/>
+            </w:tcMar>
+            <w:vAlign w:val="center"/>
+          </w:tcPr>
+          <w:p>
+            <w:pPr>
+              <w:spacing w:after="0" w:line="252"/>
+              <w:jc w:val="right"/>
+            </w:pPr>
+            <w:r>
+              <w:rPr>
+                <w:rFonts w:ascii="Times New Roman" w:cs="Times New Roman" w:eastAsia="Times New Roman" w:hAnsi="Times New Roman"/>
+                <w:b w:val="false"/>
+                <w:bCs w:val="false"/>
+                <w:sz w:val="19"/>
+                <w:szCs w:val="19"/>
+              </w:rPr>
+              <w:t xml:space="preserve">8,6</w:t>
+            </w:r>
+          </w:p>
+        </w:tc>
+        <w:tc>
+          <w:tcPr>
+            <w:tcW w:type="dxa" w:w="1500"/>
+            <w:tcBorders>
+              <w:top w:val="single" w:color="C9D3DD" w:sz="4"/>
+              <w:left w:val="single" w:color="C9D3DD" w:sz="4"/>
+              <w:bottom w:val="single" w:color="C9D3DD" w:sz="4"/>
+              <w:right w:val="single" w:color="C9D3DD" w:sz="4"/>
+            </w:tcBorders>
+            <w:tcMar>
+              <w:top w:type="dxa" w:w="50"/>
+              <w:left w:type="dxa" w:w="90"/>
+              <w:bottom w:type="dxa" w:w="50"/>
+              <w:right w:type="dxa" w:w="90"/>
+            </w:tcMar>
+            <w:vAlign w:val="center"/>
+          </w:tcPr>
+          <w:p>
+            <w:pPr>
+              <w:spacing w:after="0" w:line="252"/>
+              <w:jc w:val="right"/>
+            </w:pPr>
+            <w:r>
+              <w:rPr>
+                <w:rFonts w:ascii="Times New Roman" w:cs="Times New Roman" w:eastAsia="Times New Roman" w:hAnsi="Times New Roman"/>
+                <w:b w:val="false"/>
+                <w:bCs w:val="false"/>
+                <w:sz w:val="19"/>
+                <w:szCs w:val="19"/>
+              </w:rPr>
+              <w:t xml:space="preserve">3.150</w:t>
+            </w:r>
+          </w:p>
+        </w:tc>
+      </w:tr>
+      <w:tr>
+        <w:trPr>
+          <w:cantSplit/>
+        </w:trPr>
+        <w:tc>
+          <w:tcPr>
+            <w:tcW w:type="dxa" w:w="3500"/>
+            <w:tcBorders>
+              <w:top w:val="single" w:color="C9D3DD" w:sz="4"/>
+              <w:left w:val="single" w:color="C9D3DD" w:sz="4"/>
+              <w:bottom w:val="single" w:color="C9D3DD" w:sz="4"/>
+              <w:right w:val="single" w:color="C9D3DD" w:sz="4"/>
+            </w:tcBorders>
+            <w:shd w:fill="EEF3F8" w:color="auto" w:val="clear"/>
+            <w:tcMar>
+              <w:top w:type="dxa" w:w="50"/>
+              <w:left w:type="dxa" w:w="90"/>
+              <w:bottom w:type="dxa" w:w="50"/>
+              <w:right w:type="dxa" w:w="90"/>
+            </w:tcMar>
+            <w:vAlign w:val="center"/>
+          </w:tcPr>
+          <w:p>
+            <w:pPr>
+              <w:spacing w:after="0" w:line="252"/>
+              <w:jc w:val="left"/>
+            </w:pPr>
+            <w:r>
+              <w:rPr>
+                <w:rFonts w:ascii="Times New Roman" w:cs="Times New Roman" w:eastAsia="Times New Roman" w:hAnsi="Times New Roman"/>
+                <w:b/>
+                <w:bCs/>
+                <w:sz w:val="19"/>
+                <w:szCs w:val="19"/>
+              </w:rPr>
+              <w:t xml:space="preserve">Toplam üretim</w:t>
+            </w:r>
+          </w:p>
+        </w:tc>
+        <w:tc>
+          <w:tcPr>
+            <w:tcW w:type="dxa" w:w="3238"/>
+            <w:tcBorders>
+              <w:top w:val="single" w:color="C9D3DD" w:sz="4"/>
+              <w:left w:val="single" w:color="C9D3DD" w:sz="4"/>
+              <w:bottom w:val="single" w:color="C9D3DD" w:sz="4"/>
+              <w:right w:val="single" w:color="C9D3DD" w:sz="4"/>
+            </w:tcBorders>
+            <w:shd w:fill="EEF3F8" w:color="auto" w:val="clear"/>
+            <w:tcMar>
+              <w:top w:type="dxa" w:w="50"/>
+              <w:left w:type="dxa" w:w="90"/>
+              <w:bottom w:type="dxa" w:w="50"/>
+              <w:right w:type="dxa" w:w="90"/>
+            </w:tcMar>
+            <w:vAlign w:val="center"/>
+          </w:tcPr>
+          <w:p>
+            <w:pPr>
+              <w:spacing w:after="0" w:line="252"/>
+              <w:jc w:val="left"/>
+            </w:pPr>
+            <w:r>
+              <w:rPr>
+                <w:rFonts w:ascii="Times New Roman" w:cs="Times New Roman" w:eastAsia="Times New Roman" w:hAnsi="Times New Roman"/>
+                <w:sz w:val="19"/>
+                <w:szCs w:val="19"/>
+              </w:rPr>
+              <w:t xml:space="preserve"/>
+            </w:r>
+          </w:p>
+        </w:tc>
+        <w:tc>
+          <w:tcPr>
+            <w:tcW w:type="dxa" w:w="1400"/>
+            <w:tcBorders>
+              <w:top w:val="single" w:color="C9D3DD" w:sz="4"/>
+              <w:left w:val="single" w:color="C9D3DD" w:sz="4"/>
+              <w:bottom w:val="single" w:color="C9D3DD" w:sz="4"/>
+              <w:right w:val="single" w:color="C9D3DD" w:sz="4"/>
+            </w:tcBorders>
+            <w:shd w:fill="EEF3F8" w:color="auto" w:val="clear"/>
+            <w:tcMar>
+              <w:top w:type="dxa" w:w="50"/>
+              <w:left w:type="dxa" w:w="90"/>
+              <w:bottom w:type="dxa" w:w="50"/>
+              <w:right w:type="dxa" w:w="90"/>
+            </w:tcMar>
+            <w:vAlign w:val="center"/>
+          </w:tcPr>
+          <w:p>
+            <w:pPr>
+              <w:spacing w:after="0" w:line="252"/>
+              <w:jc w:val="right"/>
+            </w:pPr>
+            <w:r>
+              <w:rPr>
+                <w:rFonts w:ascii="Times New Roman" w:cs="Times New Roman" w:eastAsia="Times New Roman" w:hAnsi="Times New Roman"/>
+                <w:b/>
+                <w:bCs/>
+                <w:sz w:val="19"/>
+                <w:szCs w:val="19"/>
+              </w:rPr>
+              <w:t xml:space="preserve">≈30,8</w:t>
+            </w:r>
+          </w:p>
+        </w:tc>
+        <w:tc>
+          <w:tcPr>
+            <w:tcW w:type="dxa" w:w="1500"/>
+            <w:tcBorders>
+              <w:top w:val="single" w:color="C9D3DD" w:sz="4"/>
+              <w:left w:val="single" w:color="C9D3DD" w:sz="4"/>
+              <w:bottom w:val="single" w:color="C9D3DD" w:sz="4"/>
+              <w:right w:val="single" w:color="C9D3DD" w:sz="4"/>
+            </w:tcBorders>
+            <w:shd w:fill="EEF3F8" w:color="auto" w:val="clear"/>
+            <w:tcMar>
+              <w:top w:type="dxa" w:w="50"/>
+              <w:left w:type="dxa" w:w="90"/>
+              <w:bottom w:type="dxa" w:w="50"/>
+              <w:right w:type="dxa" w:w="90"/>
+            </w:tcMar>
+            <w:vAlign w:val="center"/>
+          </w:tcPr>
+          <w:p>
+            <w:pPr>
+              <w:spacing w:after="0" w:line="252"/>
+              <w:jc w:val="right"/>
+            </w:pPr>
+            <w:r>
+              <w:rPr>
+                <w:rFonts w:ascii="Times New Roman" w:cs="Times New Roman" w:eastAsia="Times New Roman" w:hAnsi="Times New Roman"/>
+                <w:b/>
+                <w:bCs/>
+                <w:sz w:val="19"/>
+                <w:szCs w:val="19"/>
+              </w:rPr>
+              <w:t xml:space="preserve">11.250</w:t>
+            </w:r>
+          </w:p>
+        </w:tc>
+      </w:tr>
+    </w:tbl>
+    <w:p>
+      <w:pPr>
+        <w:spacing w:after="100" w:before="120" w:line="360"/>
         <w:jc w:val="both"/>
       </w:pPr>
       <w:r>
@@ -19924,7 +21671,7 @@
           <w:sz w:val="22"/>
           <w:szCs w:val="22"/>
         </w:rPr>
-        <w:t xml:space="preserve">Bu nedenle Çanakkale kovanının enerji bütçesi, nöbetçi ve güvenli konum donanımı seçildikten sonra kovan boyuna göre yeniden yapılacaktır. Seçenekler; ortak yalıtımlı petekle iklimlendirme yükünü azaltmak (etkisi pilotta ölçülecek), güneş panelini büyütmek ve şebeke yedeğine daha sık başvurmaktır. Güneş panelinin büyütülmesi gerekirse bunun maliyeti Bölüm 15'teki tahminlere henüz dahil değildir.</w:t>
+        <w:t xml:space="preserve">Nöbetçi direklerinin tüketimi (20 W/direk) bir varsayımdır ve donanım seçilince netleşecektir. Ortak yalıtımlı petek iklimlendirme yükünü azaltabilir; etkisi pilotta ölçülecektir. Kovan büyüdükçe enerji bütçesi aynı yöntemle yeniden yapılır; sitedeki "Kovanını kur" hesaplayıcısı da aynı hesabı kullanır.</w:t>
       </w:r>
     </w:p>
     <w:p>
@@ -19976,7 +21723,7 @@
           <w:sz w:val="22"/>
           <w:szCs w:val="22"/>
         </w:rPr>
-        <w:t xml:space="preserve">Başvuru sürümündeki CO₂ iddiası, büyük bir havalimanının tüm yer hizmetlerini kapsayan ve hesabı verilmemiş bir tahmindi. Final sürümünde yalnızca sistemin gerçekten etkilediği kalemleri mini kovan için hesapladık (Tablo 16).</w:t>
+        <w:t xml:space="preserve">Başvuru sürümündeki CO₂ iddiası, büyük bir havalimanının tüm yer hizmetlerini kapsayan ve hesabı verilmemiş bir tahmindi. Final sürümünde yalnızca sistemin gerçekten etkilediği kalemleri mini kovan için hesapladık (Tablo 17).</w:t>
       </w:r>
     </w:p>
     <w:p>
@@ -19994,7 +21741,7 @@
           <w:sz w:val="19"/>
           <w:szCs w:val="19"/>
         </w:rPr>
-        <w:t xml:space="preserve">Tablo 16. Mini kovan için havalimanı başına yıllık doğrudan CO₂ azaltımı (tahmini)</w:t>
+        <w:t xml:space="preserve">Tablo 17. Mini kovan için havalimanı başına yıllık doğrudan CO₂ azaltımı (tahmini)</w:t>
       </w:r>
     </w:p>
     <w:tbl>
@@ -20679,7 +22426,7 @@
           <w:sz w:val="22"/>
           <w:szCs w:val="22"/>
         </w:rPr>
-        <w:t xml:space="preserve">Bu değer tek bir havalimanı için küçüktür ve bunu açıkça belirtmek istiyoruz. Sistem 20 bölgesel havalimanına yaygınlaştırıldığında doğrudan azaltım yılda yaklaşık 200 ton seviyesine ulaşır. Çanakkale kovanında fazla enerji azaldığı için elektrikli saha aracı kalemi küçülür; CO₂ hesabı, kovan boyuna göre yenilenecek enerji bütçesiyle birlikte güncellenecektir. Asıl sürdürülebilirlik kazancı dolaylı etkilerdedir.</w:t>
+        <w:t xml:space="preserve">Bu değer tek bir havalimanı için küçüktür ve bunu açıkça belirtmek istiyoruz. Sistem 20 bölgesel havalimanına yaygınlaştırıldığında doğrudan azaltım yılda yaklaşık 200 ton seviyesine ulaşır. Tablo mini kovan içindir; 6 kWp güneşli Çanakkale kovanında fazla enerji (11.250 − 7.620 ≈ 3.630 kWh/yıl) mini kovandakine yakındır, CO₂ hesabı kovan boyuna göre ayrıca güncellenecektir. Asıl sürdürülebilirlik kazancı dolaylı etkilerdedir.</w:t>
       </w:r>
     </w:p>
     <w:p>
@@ -21244,7 +22991,7 @@
           <w:sz w:val="22"/>
           <w:szCs w:val="22"/>
         </w:rPr>
-        <w:t xml:space="preserve">V3'te maliyeti tek bir rakam yerine kovan boylarına göre veriyoruz (Tablo 17). Bütün değerler 2026 piyasa koşullarına göre ön tahmindir ve ±%30 belirsizlik içerir.</w:t>
+        <w:t xml:space="preserve">V3'te maliyeti tek bir rakam yerine kovan boylarına göre veriyoruz (Tablo 18). Bütün değerler 2026 piyasa koşullarına göre ön tahmindir ve ±%30 belirsizlik içerir.</w:t>
       </w:r>
     </w:p>
     <w:p>
@@ -21262,7 +23009,7 @@
           <w:sz w:val="19"/>
           <w:szCs w:val="19"/>
         </w:rPr>
-        <w:t xml:space="preserve">Tablo 17. Kovan boylarına göre tahmini maliyet (ön tahmin, ±%30)</w:t>
+        <w:t xml:space="preserve">Tablo 18. Kovan boylarına göre tahmini maliyet (ön tahmin, ±%30)</w:t>
       </w:r>
     </w:p>
     <w:tbl>
@@ -21645,7 +23392,7 @@
                 <w:sz w:val="19"/>
                 <w:szCs w:val="19"/>
               </w:rPr>
-              <w:t xml:space="preserve">2 kâşif, 1 bekçi, 1 işçi, nöbetçiler, güvenli konum</w:t>
+              <w:t xml:space="preserve">2 kâşif, 1 bekçi, 1 işçi, nöbetçiler, güvenli konum, 6 kWp güneş</w:t>
             </w:r>
           </w:p>
         </w:tc>
@@ -21680,7 +23427,7 @@
                 <w:sz w:val="19"/>
                 <w:szCs w:val="19"/>
               </w:rPr>
-              <w:t xml:space="preserve">≈215 bin $</w:t>
+              <w:t xml:space="preserve">≈218 bin $</w:t>
             </w:r>
           </w:p>
         </w:tc>
@@ -21715,7 +23462,7 @@
                 <w:sz w:val="19"/>
                 <w:szCs w:val="19"/>
               </w:rPr>
-              <w:t xml:space="preserve">≈62 bin $</w:t>
+              <w:t xml:space="preserve">≈63 bin $</w:t>
             </w:r>
           </w:p>
         </w:tc>
@@ -21822,7 +23569,7 @@
                 <w:sz w:val="19"/>
                 <w:szCs w:val="19"/>
               </w:rPr>
-              <w:t xml:space="preserve">≈220 bin $</w:t>
+              <w:t xml:space="preserve">≈223 bin $</w:t>
             </w:r>
           </w:p>
         </w:tc>
@@ -21856,7 +23603,7 @@
                 <w:sz w:val="19"/>
                 <w:szCs w:val="19"/>
               </w:rPr>
-              <w:t xml:space="preserve">≈63 bin $</w:t>
+              <w:t xml:space="preserve">≈64 bin $</w:t>
             </w:r>
           </w:p>
         </w:tc>
@@ -22017,7 +23764,7 @@
           <w:sz w:val="22"/>
           <w:szCs w:val="22"/>
         </w:rPr>
-        <w:t xml:space="preserve">Çanakkale kovanı, mini kovana Tablo 18'deki ek kalemlerin eklenmesiyle oluşur.</w:t>
+        <w:t xml:space="preserve">Çanakkale kovanı, mini kovana Tablo 19'deki ek kalemlerin eklenmesiyle oluşur.</w:t>
       </w:r>
     </w:p>
     <w:p>
@@ -22035,7 +23782,7 @@
           <w:sz w:val="19"/>
           <w:szCs w:val="19"/>
         </w:rPr>
-        <w:t xml:space="preserve">Tablo 18. Mini kovandan Çanakkale ve kış kovanına ek kalemler (ön tahmin, ±%30)</w:t>
+        <w:t xml:space="preserve">Tablo 19. Mini kovandan Çanakkale ve kış kovanına ek kalemler (ön tahmin, ±%30)</w:t>
       </w:r>
     </w:p>
     <w:tbl>
@@ -22167,7 +23914,7 @@
                 <w:sz w:val="19"/>
                 <w:szCs w:val="19"/>
               </w:rPr>
-              <w:t xml:space="preserve">Mini kovan (kalem dökümü Tablo 19)</w:t>
+              <w:t xml:space="preserve">Mini kovan (kalem dökümü Tablo 20)</w:t>
             </w:r>
           </w:p>
         </w:tc>
@@ -22584,29 +24331,28 @@
               <w:bottom w:val="single" w:color="C9D3DD" w:sz="4"/>
               <w:right w:val="single" w:color="C9D3DD" w:sz="4"/>
             </w:tcBorders>
-            <w:shd w:fill="EEF3F8" w:color="auto" w:val="clear"/>
-            <w:tcMar>
-              <w:top w:type="dxa" w:w="50"/>
-              <w:left w:type="dxa" w:w="90"/>
-              <w:bottom w:type="dxa" w:w="50"/>
-              <w:right w:type="dxa" w:w="90"/>
-            </w:tcMar>
-            <w:vAlign w:val="center"/>
-          </w:tcPr>
-          <w:p>
-            <w:pPr>
-              <w:spacing w:after="0" w:line="252"/>
-              <w:jc w:val="left"/>
-            </w:pPr>
-            <w:r>
-              <w:rPr>
-                <w:rFonts w:ascii="Times New Roman" w:cs="Times New Roman" w:eastAsia="Times New Roman" w:hAnsi="Times New Roman"/>
-                <w:b/>
-                <w:bCs/>
-                <w:sz w:val="19"/>
-                <w:szCs w:val="19"/>
-              </w:rPr>
-              <w:t xml:space="preserve">Çanakkale kovanı</w:t>
+            <w:tcMar>
+              <w:top w:type="dxa" w:w="50"/>
+              <w:left w:type="dxa" w:w="90"/>
+              <w:bottom w:type="dxa" w:w="50"/>
+              <w:right w:type="dxa" w:w="90"/>
+            </w:tcMar>
+            <w:vAlign w:val="center"/>
+          </w:tcPr>
+          <w:p>
+            <w:pPr>
+              <w:spacing w:after="0" w:line="252"/>
+              <w:jc w:val="left"/>
+            </w:pPr>
+            <w:r>
+              <w:rPr>
+                <w:rFonts w:ascii="Times New Roman" w:cs="Times New Roman" w:eastAsia="Times New Roman" w:hAnsi="Times New Roman"/>
+                <w:b w:val="false"/>
+                <w:bCs w:val="false"/>
+                <w:sz w:val="19"/>
+                <w:szCs w:val="19"/>
+              </w:rPr>
+              <w:t xml:space="preserve">+2 kWp güneş paneli (4 → 6 kWp, kurulu)</w:t>
             </w:r>
           </w:p>
         </w:tc>
@@ -22619,7 +24365,6 @@
               <w:bottom w:val="single" w:color="C9D3DD" w:sz="4"/>
               <w:right w:val="single" w:color="C9D3DD" w:sz="4"/>
             </w:tcBorders>
-            <w:shd w:fill="EEF3F8" w:color="auto" w:val="clear"/>
             <w:tcMar>
               <w:top w:type="dxa" w:w="50"/>
               <w:left w:type="dxa" w:w="90"/>
@@ -22636,12 +24381,12 @@
             <w:r>
               <w:rPr>
                 <w:rFonts w:ascii="Times New Roman" w:cs="Times New Roman" w:eastAsia="Times New Roman" w:hAnsi="Times New Roman"/>
-                <w:b/>
-                <w:bCs/>
-                <w:sz w:val="19"/>
-                <w:szCs w:val="19"/>
-              </w:rPr>
-              <w:t xml:space="preserve">≈215.000</w:t>
+                <w:b w:val="false"/>
+                <w:bCs w:val="false"/>
+                <w:sz w:val="19"/>
+                <w:szCs w:val="19"/>
+              </w:rPr>
+              <w:t xml:space="preserve">≈2.500</w:t>
             </w:r>
           </w:p>
         </w:tc>
@@ -22659,28 +24404,29 @@
               <w:bottom w:val="single" w:color="C9D3DD" w:sz="4"/>
               <w:right w:val="single" w:color="C9D3DD" w:sz="4"/>
             </w:tcBorders>
-            <w:tcMar>
-              <w:top w:type="dxa" w:w="50"/>
-              <w:left w:type="dxa" w:w="90"/>
-              <w:bottom w:type="dxa" w:w="50"/>
-              <w:right w:type="dxa" w:w="90"/>
-            </w:tcMar>
-            <w:vAlign w:val="center"/>
-          </w:tcPr>
-          <w:p>
-            <w:pPr>
-              <w:spacing w:after="0" w:line="252"/>
-              <w:jc w:val="left"/>
-            </w:pPr>
-            <w:r>
-              <w:rPr>
-                <w:rFonts w:ascii="Times New Roman" w:cs="Times New Roman" w:eastAsia="Times New Roman" w:hAnsi="Times New Roman"/>
-                <w:b w:val="false"/>
-                <w:bCs w:val="false"/>
-                <w:sz w:val="19"/>
-                <w:szCs w:val="19"/>
-              </w:rPr>
-              <w:t xml:space="preserve">Bakıcı rolü (yazılım ve kalibrasyon)</w:t>
+            <w:shd w:fill="EEF3F8" w:color="auto" w:val="clear"/>
+            <w:tcMar>
+              <w:top w:type="dxa" w:w="50"/>
+              <w:left w:type="dxa" w:w="90"/>
+              <w:bottom w:type="dxa" w:w="50"/>
+              <w:right w:type="dxa" w:w="90"/>
+            </w:tcMar>
+            <w:vAlign w:val="center"/>
+          </w:tcPr>
+          <w:p>
+            <w:pPr>
+              <w:spacing w:after="0" w:line="252"/>
+              <w:jc w:val="left"/>
+            </w:pPr>
+            <w:r>
+              <w:rPr>
+                <w:rFonts w:ascii="Times New Roman" w:cs="Times New Roman" w:eastAsia="Times New Roman" w:hAnsi="Times New Roman"/>
+                <w:b/>
+                <w:bCs/>
+                <w:sz w:val="19"/>
+                <w:szCs w:val="19"/>
+              </w:rPr>
+              <w:t xml:space="preserve">Çanakkale kovanı</w:t>
             </w:r>
           </w:p>
         </w:tc>
@@ -22693,6 +24439,7 @@
               <w:bottom w:val="single" w:color="C9D3DD" w:sz="4"/>
               <w:right w:val="single" w:color="C9D3DD" w:sz="4"/>
             </w:tcBorders>
+            <w:shd w:fill="EEF3F8" w:color="auto" w:val="clear"/>
             <w:tcMar>
               <w:top w:type="dxa" w:w="50"/>
               <w:left w:type="dxa" w:w="90"/>
@@ -22709,12 +24456,12 @@
             <w:r>
               <w:rPr>
                 <w:rFonts w:ascii="Times New Roman" w:cs="Times New Roman" w:eastAsia="Times New Roman" w:hAnsi="Times New Roman"/>
-                <w:b w:val="false"/>
-                <w:bCs w:val="false"/>
-                <w:sz w:val="19"/>
-                <w:szCs w:val="19"/>
-              </w:rPr>
-              <w:t xml:space="preserve">≈5.000</w:t>
+                <w:b/>
+                <w:bCs/>
+                <w:sz w:val="19"/>
+                <w:szCs w:val="19"/>
+              </w:rPr>
+              <w:t xml:space="preserve">≈218.000</w:t>
             </w:r>
           </w:p>
         </w:tc>
@@ -22732,6 +24479,79 @@
               <w:bottom w:val="single" w:color="C9D3DD" w:sz="4"/>
               <w:right w:val="single" w:color="C9D3DD" w:sz="4"/>
             </w:tcBorders>
+            <w:tcMar>
+              <w:top w:type="dxa" w:w="50"/>
+              <w:left w:type="dxa" w:w="90"/>
+              <w:bottom w:type="dxa" w:w="50"/>
+              <w:right w:type="dxa" w:w="90"/>
+            </w:tcMar>
+            <w:vAlign w:val="center"/>
+          </w:tcPr>
+          <w:p>
+            <w:pPr>
+              <w:spacing w:after="0" w:line="252"/>
+              <w:jc w:val="left"/>
+            </w:pPr>
+            <w:r>
+              <w:rPr>
+                <w:rFonts w:ascii="Times New Roman" w:cs="Times New Roman" w:eastAsia="Times New Roman" w:hAnsi="Times New Roman"/>
+                <w:b w:val="false"/>
+                <w:bCs w:val="false"/>
+                <w:sz w:val="19"/>
+                <w:szCs w:val="19"/>
+              </w:rPr>
+              <w:t xml:space="preserve">Bakıcı rolü (yazılım ve kalibrasyon)</w:t>
+            </w:r>
+          </w:p>
+        </w:tc>
+        <w:tc>
+          <w:tcPr>
+            <w:tcW w:type="dxa" w:w="3000"/>
+            <w:tcBorders>
+              <w:top w:val="single" w:color="C9D3DD" w:sz="4"/>
+              <w:left w:val="single" w:color="C9D3DD" w:sz="4"/>
+              <w:bottom w:val="single" w:color="C9D3DD" w:sz="4"/>
+              <w:right w:val="single" w:color="C9D3DD" w:sz="4"/>
+            </w:tcBorders>
+            <w:tcMar>
+              <w:top w:type="dxa" w:w="50"/>
+              <w:left w:type="dxa" w:w="90"/>
+              <w:bottom w:type="dxa" w:w="50"/>
+              <w:right w:type="dxa" w:w="90"/>
+            </w:tcMar>
+            <w:vAlign w:val="center"/>
+          </w:tcPr>
+          <w:p>
+            <w:pPr>
+              <w:spacing w:after="0" w:line="252"/>
+              <w:jc w:val="right"/>
+            </w:pPr>
+            <w:r>
+              <w:rPr>
+                <w:rFonts w:ascii="Times New Roman" w:cs="Times New Roman" w:eastAsia="Times New Roman" w:hAnsi="Times New Roman"/>
+                <w:b w:val="false"/>
+                <w:bCs w:val="false"/>
+                <w:sz w:val="19"/>
+                <w:szCs w:val="19"/>
+              </w:rPr>
+              <w:t xml:space="preserve">≈5.000</w:t>
+            </w:r>
+          </w:p>
+        </w:tc>
+      </w:tr>
+      <w:tr>
+        <w:trPr>
+          <w:cantSplit/>
+        </w:trPr>
+        <w:tc>
+          <w:tcPr>
+            <w:tcW w:type="dxa" w:w="6638"/>
+            <w:tcBorders>
+              <w:top w:val="single" w:color="C9D3DD" w:sz="4"/>
+              <w:left w:val="single" w:color="C9D3DD" w:sz="4"/>
+              <w:bottom w:val="single" w:color="C9D3DD" w:sz="4"/>
+              <w:right w:val="single" w:color="C9D3DD" w:sz="4"/>
+            </w:tcBorders>
             <w:shd w:fill="EEF3F8" w:color="auto" w:val="clear"/>
             <w:tcMar>
               <w:top w:type="dxa" w:w="50"/>
@@ -22789,7 +24609,7 @@
                 <w:sz w:val="19"/>
                 <w:szCs w:val="19"/>
               </w:rPr>
-              <w:t xml:space="preserve">≈220.000</w:t>
+              <w:t xml:space="preserve">≈223.000</w:t>
             </w:r>
           </w:p>
         </w:tc>
@@ -22810,7 +24630,7 @@
           <w:sz w:val="19"/>
           <w:szCs w:val="19"/>
         </w:rPr>
-        <w:t xml:space="preserve">Tablo 19. Mini kovan kalem dökümü (final raporundaki ilk kurulum tahmini)</w:t>
+        <w:t xml:space="preserve">Tablo 20. Mini kovan kalem dökümü (final raporundaki ilk kurulum tahmini)</w:t>
       </w:r>
     </w:p>
     <w:tbl>
@@ -23654,7 +25474,7 @@
           <w:sz w:val="22"/>
           <w:szCs w:val="22"/>
         </w:rPr>
-        <w:t xml:space="preserve">Yıllık işletme gideri (bakım, yedek parça, yazılım güncellemeleri, sigorta ve haberleşme) mini kovanda yaklaşık 14 bin $, Çanakkale kovanında yaklaşık 19 bin $ olarak öngörülmüştür. Beş yıla yayılmış yıllık maliyet, kurulum ile beş yıllık işletme toplamının beşe bölünmesiyle bulunur; örneğin Çanakkale kovanı için (215 + 5 × 19) ÷ 5 ≈ 62 bin $. Yazılım geliştirme maliyeti tekrarlanmadığı için mini kovanın sonraki havalimanlarında kurulum maliyetinin yaklaşık 90 bin $'a düşmesi beklenmektedir. Bölüm 12.5'te belirtildiği gibi Çanakkale kovanında güneş panelinin büyütülmesi gerekirse bu tutar tahminlere eklenecektir.</w:t>
+        <w:t xml:space="preserve">Yıllık işletme gideri (bakım, yedek parça, yazılım güncellemeleri, sigorta ve haberleşme) mini kovanda yaklaşık 14 bin $, Çanakkale kovanında yaklaşık 19 bin $ olarak öngörülmüştür. Beş yıla yayılmış yıllık maliyet, kurulum ile beş yıllık işletme toplamının beşe bölünmesiyle bulunur; örneğin Çanakkale kovanı için (218 + 5 × 19) ÷ 5 ≈ 63 bin $. Yazılım geliştirme maliyeti tekrarlanmadığı için mini kovanın sonraki havalimanlarında kurulum maliyetinin yaklaşık 90 bin $'a düşmesi beklenmektedir. Çanakkale kovanının enerji payı için gereken +2 kWp güneş paneli (≈2,5 bin $, raporun birim fiyatıyla) bu tahminlere dahildir (Bölüm 12.5).</w:t>
       </w:r>
     </w:p>
     <w:p>
@@ -23734,7 +25554,7 @@
           <w:sz w:val="22"/>
           <w:szCs w:val="22"/>
         </w:rPr>
-        <w:t xml:space="preserve">30 aylık plan dört faz ve yedi iş paketinden oluşur (Şekil 9, Tablo 20). V3 yetenekleri planın süresini değiştirmez; kastlar olgunluklarına göre aşamalı olarak devreye girer:</w:t>
+        <w:t xml:space="preserve">30 aylık plan dört faz ve yedi iş paketinden oluşur (Şekil 9, Tablo 21). V3 yetenekleri planın süresini değiştirmez; kastlar olgunluklarına göre aşamalı olarak devreye girer:</w:t>
       </w:r>
     </w:p>
     <w:p>
@@ -23900,7 +25720,7 @@
           <w:sz w:val="19"/>
           <w:szCs w:val="19"/>
         </w:rPr>
-        <w:t xml:space="preserve">Tablo 20. İş paketleri ve çıktıları</w:t>
+        <w:t xml:space="preserve">Tablo 21. İş paketleri ve çıktıları</w:t>
       </w:r>
     </w:p>
     <w:tbl>
@@ -25109,7 +26929,7 @@
           <w:sz w:val="19"/>
           <w:szCs w:val="19"/>
         </w:rPr>
-        <w:t xml:space="preserve">Tablo 21. Başlıca riskler ve önlemler</w:t>
+        <w:t xml:space="preserve">Tablo 22. Başlıca riskler ve önlemler</w:t>
       </w:r>
     </w:p>
     <w:tbl>
@@ -26968,7 +28788,7 @@
                 <w:sz w:val="18"/>
                 <w:szCs w:val="18"/>
               </w:rPr>
-              <w:t xml:space="preserve">Enerji bütçesini kovan boyuna göre yenilemek, ortak yalıtımlı petek, gerekirse güneş panelini büyütmek, şebeke yedeği</w:t>
+              <w:t xml:space="preserve">Enerji bütçesini kovan boyuna göre yapmak (Çanakkale kovanında güneş 6 kWp, ≈1,5×), ortak yalıtımlı petek, şebeke yedeği</w:t>
             </w:r>
           </w:p>
         </w:tc>

</xml_diff>